<commit_message>
Organiza temp, cria md de ajustes e corrige legenda M2P1L1p2
</commit_message>
<xml_diff>
--- a/temp/Ajustes_Módulo I.docx
+++ b/temp/Ajustes_Módulo I.docx
@@ -4067,6 +4067,16 @@
         <w:t>a) Porque o desenvolvimento da criança começa somente após o nascimento</w:t>
       </w:r>
       <w:r>
+        <w:rPr>
+          <w:rFonts w:ascii="Aptos" w:hAnsi="Aptos" w:eastAsia="Aptos" w:cs="Aptos"/>
+          <w:noProof w:val="0"/>
+          <w:sz w:val="24"/>
+          <w:szCs w:val="24"/>
+          <w:lang w:val="pt-BR"/>
+        </w:rPr>
+        <w:t>.</w:t>
+      </w:r>
+      <w:r>
         <w:br/>
       </w:r>
       <w:r>
@@ -4077,7 +4087,27 @@
           <w:szCs w:val="24"/>
           <w:lang w:val="pt-BR"/>
         </w:rPr>
-        <w:t xml:space="preserve">b) Porque, durante a gestação, o bebê já está em intenso processo de desenvolvimento </w:t>
+        <w:t>b) Porque, durante a gestação, o bebê já está em intenso processo de desenvolvimento</w:t>
+      </w:r>
+      <w:r>
+        <w:rPr>
+          <w:rFonts w:ascii="Aptos" w:hAnsi="Aptos" w:eastAsia="Aptos" w:cs="Aptos"/>
+          <w:noProof w:val="0"/>
+          <w:sz w:val="24"/>
+          <w:szCs w:val="24"/>
+          <w:lang w:val="pt-BR"/>
+        </w:rPr>
+        <w:t>.</w:t>
+      </w:r>
+      <w:r>
+        <w:rPr>
+          <w:rFonts w:ascii="Aptos" w:hAnsi="Aptos" w:eastAsia="Aptos" w:cs="Aptos"/>
+          <w:noProof w:val="0"/>
+          <w:sz w:val="24"/>
+          <w:szCs w:val="24"/>
+          <w:lang w:val="pt-BR"/>
+        </w:rPr>
+        <w:t xml:space="preserve"> </w:t>
       </w:r>
       <w:r>
         <w:rPr>
@@ -4105,6 +4135,16 @@
         <w:t>c) Porque apenas a alimentação da gestante interfere no desenvolvimento do bebê</w:t>
       </w:r>
       <w:r>
+        <w:rPr>
+          <w:rFonts w:ascii="Aptos" w:hAnsi="Aptos" w:eastAsia="Aptos" w:cs="Aptos"/>
+          <w:noProof w:val="0"/>
+          <w:sz w:val="24"/>
+          <w:szCs w:val="24"/>
+          <w:lang w:val="pt-BR"/>
+        </w:rPr>
+        <w:t>.</w:t>
+      </w:r>
+      <w:r>
         <w:br/>
       </w:r>
       <w:r>
@@ -4117,6 +4157,16 @@
         </w:rPr>
         <w:t>d) Porque os estímulos e o ambiente só passam a ter importância nos últimos dias da gestação</w:t>
       </w:r>
+      <w:r>
+        <w:rPr>
+          <w:rFonts w:ascii="Aptos" w:hAnsi="Aptos" w:eastAsia="Aptos" w:cs="Aptos"/>
+          <w:noProof w:val="0"/>
+          <w:sz w:val="24"/>
+          <w:szCs w:val="24"/>
+          <w:lang w:val="pt-BR"/>
+        </w:rPr>
+        <w:t>.</w:t>
+      </w:r>
     </w:p>
     <w:p>
       <w:pPr>
@@ -4218,6 +4268,16 @@
         <w:t>a) Apenas fatores genéticos</w:t>
       </w:r>
       <w:r>
+        <w:rPr>
+          <w:rFonts w:ascii="Aptos" w:hAnsi="Aptos" w:eastAsia="Aptos" w:cs="Aptos"/>
+          <w:noProof w:val="0"/>
+          <w:sz w:val="24"/>
+          <w:szCs w:val="24"/>
+          <w:lang w:val="pt-BR"/>
+        </w:rPr>
+        <w:t>.</w:t>
+      </w:r>
+      <w:r>
         <w:br/>
       </w:r>
       <w:r>
@@ -4231,6 +4291,16 @@
         <w:t>b) Principalmente a escola</w:t>
       </w:r>
       <w:r>
+        <w:rPr>
+          <w:rFonts w:ascii="Aptos" w:hAnsi="Aptos" w:eastAsia="Aptos" w:cs="Aptos"/>
+          <w:noProof w:val="0"/>
+          <w:sz w:val="24"/>
+          <w:szCs w:val="24"/>
+          <w:lang w:val="pt-BR"/>
+        </w:rPr>
+        <w:t>.</w:t>
+      </w:r>
+      <w:r>
         <w:br/>
       </w:r>
       <w:r>
@@ -4241,7 +4311,27 @@
           <w:szCs w:val="24"/>
           <w:lang w:val="pt-BR"/>
         </w:rPr>
-        <w:t xml:space="preserve">c) As interações, os cuidados e o ambiente em que a criança vive </w:t>
+        <w:t>c) As interações, os cuidados e o ambiente em que a criança vive</w:t>
+      </w:r>
+      <w:r>
+        <w:rPr>
+          <w:rFonts w:ascii="Aptos" w:hAnsi="Aptos" w:eastAsia="Aptos" w:cs="Aptos"/>
+          <w:noProof w:val="0"/>
+          <w:sz w:val="24"/>
+          <w:szCs w:val="24"/>
+          <w:lang w:val="pt-BR"/>
+        </w:rPr>
+        <w:t>.</w:t>
+      </w:r>
+      <w:r>
+        <w:rPr>
+          <w:rFonts w:ascii="Aptos" w:hAnsi="Aptos" w:eastAsia="Aptos" w:cs="Aptos"/>
+          <w:noProof w:val="0"/>
+          <w:sz w:val="24"/>
+          <w:szCs w:val="24"/>
+          <w:lang w:val="pt-BR"/>
+        </w:rPr>
+        <w:t xml:space="preserve"> </w:t>
       </w:r>
       <w:r>
         <w:rPr>
@@ -4268,6 +4358,16 @@
         </w:rPr>
         <w:t>d) Somente os estímulos oferecidos pelos adultos</w:t>
       </w:r>
+      <w:r>
+        <w:rPr>
+          <w:rFonts w:ascii="Aptos" w:hAnsi="Aptos" w:eastAsia="Aptos" w:cs="Aptos"/>
+          <w:noProof w:val="0"/>
+          <w:sz w:val="24"/>
+          <w:szCs w:val="24"/>
+          <w:lang w:val="pt-BR"/>
+        </w:rPr>
+        <w:t>.</w:t>
+      </w:r>
     </w:p>
     <w:p>
       <w:pPr>
@@ -4369,6 +4469,16 @@
         <w:t>a) A escrita e a leitura</w:t>
       </w:r>
       <w:r>
+        <w:rPr>
+          <w:rFonts w:ascii="Aptos" w:hAnsi="Aptos" w:eastAsia="Aptos" w:cs="Aptos"/>
+          <w:noProof w:val="0"/>
+          <w:sz w:val="24"/>
+          <w:szCs w:val="24"/>
+          <w:lang w:val="pt-BR"/>
+        </w:rPr>
+        <w:t>.</w:t>
+      </w:r>
+      <w:r>
         <w:br/>
       </w:r>
       <w:r>
@@ -4379,7 +4489,27 @@
           <w:szCs w:val="24"/>
           <w:lang w:val="pt-BR"/>
         </w:rPr>
-        <w:t xml:space="preserve">b) O choro, os gestos e os sons </w:t>
+        <w:t>b) O choro, os gestos e os sons</w:t>
+      </w:r>
+      <w:r>
+        <w:rPr>
+          <w:rFonts w:ascii="Aptos" w:hAnsi="Aptos" w:eastAsia="Aptos" w:cs="Aptos"/>
+          <w:noProof w:val="0"/>
+          <w:sz w:val="24"/>
+          <w:szCs w:val="24"/>
+          <w:lang w:val="pt-BR"/>
+        </w:rPr>
+        <w:t>.</w:t>
+      </w:r>
+      <w:r>
+        <w:rPr>
+          <w:rFonts w:ascii="Aptos" w:hAnsi="Aptos" w:eastAsia="Aptos" w:cs="Aptos"/>
+          <w:noProof w:val="0"/>
+          <w:sz w:val="24"/>
+          <w:szCs w:val="24"/>
+          <w:lang w:val="pt-BR"/>
+        </w:rPr>
+        <w:t xml:space="preserve"> </w:t>
       </w:r>
       <w:r>
         <w:rPr>
@@ -4407,6 +4537,16 @@
         <w:t>c) As frases completas</w:t>
       </w:r>
       <w:r>
+        <w:rPr>
+          <w:rFonts w:ascii="Aptos" w:hAnsi="Aptos" w:eastAsia="Aptos" w:cs="Aptos"/>
+          <w:noProof w:val="0"/>
+          <w:sz w:val="24"/>
+          <w:szCs w:val="24"/>
+          <w:lang w:val="pt-BR"/>
+        </w:rPr>
+        <w:t>.</w:t>
+      </w:r>
+      <w:r>
         <w:br/>
       </w:r>
       <w:r>
@@ -4419,6 +4559,16 @@
         </w:rPr>
         <w:t>d) As perguntas e as histórias</w:t>
       </w:r>
+      <w:r>
+        <w:rPr>
+          <w:rFonts w:ascii="Aptos" w:hAnsi="Aptos" w:eastAsia="Aptos" w:cs="Aptos"/>
+          <w:noProof w:val="0"/>
+          <w:sz w:val="24"/>
+          <w:szCs w:val="24"/>
+          <w:lang w:val="pt-BR"/>
+        </w:rPr>
+        <w:t>.</w:t>
+      </w:r>
     </w:p>
     <w:p>
       <w:pPr>
@@ -4520,6 +4670,16 @@
         <w:t>a) A criança deixa de demonstrar emoções</w:t>
       </w:r>
       <w:r>
+        <w:rPr>
+          <w:rFonts w:ascii="Aptos" w:hAnsi="Aptos" w:eastAsia="Aptos" w:cs="Aptos"/>
+          <w:noProof w:val="0"/>
+          <w:sz w:val="24"/>
+          <w:szCs w:val="24"/>
+          <w:lang w:val="pt-BR"/>
+        </w:rPr>
+        <w:t>.</w:t>
+      </w:r>
+      <w:r>
         <w:br/>
       </w:r>
       <w:r>
@@ -4530,7 +4690,27 @@
           <w:szCs w:val="24"/>
           <w:lang w:val="pt-BR"/>
         </w:rPr>
-        <w:t xml:space="preserve">b) A criança começa a se afirmar e a dizer “não” com mais frequência </w:t>
+        <w:t>b) A criança começa a se afirmar e a dizer “não” com mais frequência</w:t>
+      </w:r>
+      <w:r>
+        <w:rPr>
+          <w:rFonts w:ascii="Aptos" w:hAnsi="Aptos" w:eastAsia="Aptos" w:cs="Aptos"/>
+          <w:noProof w:val="0"/>
+          <w:sz w:val="24"/>
+          <w:szCs w:val="24"/>
+          <w:lang w:val="pt-BR"/>
+        </w:rPr>
+        <w:t>.</w:t>
+      </w:r>
+      <w:r>
+        <w:rPr>
+          <w:rFonts w:ascii="Aptos" w:hAnsi="Aptos" w:eastAsia="Aptos" w:cs="Aptos"/>
+          <w:noProof w:val="0"/>
+          <w:sz w:val="24"/>
+          <w:szCs w:val="24"/>
+          <w:lang w:val="pt-BR"/>
+        </w:rPr>
+        <w:t xml:space="preserve"> </w:t>
       </w:r>
       <w:r>
         <w:rPr>
@@ -4558,6 +4738,16 @@
         <w:t>c) A criança passa a escrever frases completas</w:t>
       </w:r>
       <w:r>
+        <w:rPr>
+          <w:rFonts w:ascii="Aptos" w:hAnsi="Aptos" w:eastAsia="Aptos" w:cs="Aptos"/>
+          <w:noProof w:val="0"/>
+          <w:sz w:val="24"/>
+          <w:szCs w:val="24"/>
+          <w:lang w:val="pt-BR"/>
+        </w:rPr>
+        <w:t>.</w:t>
+      </w:r>
+      <w:r>
         <w:br/>
       </w:r>
       <w:r>
@@ -4570,6 +4760,16 @@
         </w:rPr>
         <w:t>d) A criança deixa de buscar interação com outras pessoas</w:t>
       </w:r>
+      <w:r>
+        <w:rPr>
+          <w:rFonts w:ascii="Aptos" w:hAnsi="Aptos" w:eastAsia="Aptos" w:cs="Aptos"/>
+          <w:noProof w:val="0"/>
+          <w:sz w:val="24"/>
+          <w:szCs w:val="24"/>
+          <w:lang w:val="pt-BR"/>
+        </w:rPr>
+        <w:t>.</w:t>
+      </w:r>
     </w:p>
     <w:p>
       <w:pPr>
@@ -4671,6 +4871,16 @@
         <w:t>a) 0 a 1 ano</w:t>
       </w:r>
       <w:r>
+        <w:rPr>
+          <w:rFonts w:ascii="Aptos" w:hAnsi="Aptos" w:eastAsia="Aptos" w:cs="Aptos"/>
+          <w:noProof w:val="0"/>
+          <w:sz w:val="24"/>
+          <w:szCs w:val="24"/>
+          <w:lang w:val="pt-BR"/>
+        </w:rPr>
+        <w:t>.</w:t>
+      </w:r>
+      <w:r>
         <w:br/>
       </w:r>
       <w:r>
@@ -4684,6 +4894,16 @@
         <w:t>b) 1 a 2 anos</w:t>
       </w:r>
       <w:r>
+        <w:rPr>
+          <w:rFonts w:ascii="Aptos" w:hAnsi="Aptos" w:eastAsia="Aptos" w:cs="Aptos"/>
+          <w:noProof w:val="0"/>
+          <w:sz w:val="24"/>
+          <w:szCs w:val="24"/>
+          <w:lang w:val="pt-BR"/>
+        </w:rPr>
+        <w:t>.</w:t>
+      </w:r>
+      <w:r>
         <w:br/>
       </w:r>
       <w:r>
@@ -4694,7 +4914,27 @@
           <w:szCs w:val="24"/>
           <w:lang w:val="pt-BR"/>
         </w:rPr>
-        <w:t xml:space="preserve">c) 3 a 4 anos </w:t>
+        <w:t>c) 3 a 4 anos</w:t>
+      </w:r>
+      <w:r>
+        <w:rPr>
+          <w:rFonts w:ascii="Aptos" w:hAnsi="Aptos" w:eastAsia="Aptos" w:cs="Aptos"/>
+          <w:noProof w:val="0"/>
+          <w:sz w:val="24"/>
+          <w:szCs w:val="24"/>
+          <w:lang w:val="pt-BR"/>
+        </w:rPr>
+        <w:t>.</w:t>
+      </w:r>
+      <w:r>
+        <w:rPr>
+          <w:rFonts w:ascii="Aptos" w:hAnsi="Aptos" w:eastAsia="Aptos" w:cs="Aptos"/>
+          <w:noProof w:val="0"/>
+          <w:sz w:val="24"/>
+          <w:szCs w:val="24"/>
+          <w:lang w:val="pt-BR"/>
+        </w:rPr>
+        <w:t xml:space="preserve"> </w:t>
       </w:r>
       <w:r>
         <w:rPr>
@@ -4721,6 +4961,16 @@
         </w:rPr>
         <w:t>d) 5 a 6 anos</w:t>
       </w:r>
+      <w:r>
+        <w:rPr>
+          <w:rFonts w:ascii="Aptos" w:hAnsi="Aptos" w:eastAsia="Aptos" w:cs="Aptos"/>
+          <w:noProof w:val="0"/>
+          <w:sz w:val="24"/>
+          <w:szCs w:val="24"/>
+          <w:lang w:val="pt-BR"/>
+        </w:rPr>
+        <w:t>.</w:t>
+      </w:r>
     </w:p>
     <w:p>
       <w:pPr>
@@ -4822,6 +5072,16 @@
         <w:t>a) Por volta de 1 ano</w:t>
       </w:r>
       <w:r>
+        <w:rPr>
+          <w:rFonts w:ascii="Aptos" w:hAnsi="Aptos" w:eastAsia="Aptos" w:cs="Aptos"/>
+          <w:noProof w:val="0"/>
+          <w:sz w:val="24"/>
+          <w:szCs w:val="24"/>
+          <w:lang w:val="pt-BR"/>
+        </w:rPr>
+        <w:t>.</w:t>
+      </w:r>
+      <w:r>
         <w:br/>
       </w:r>
       <w:r>
@@ -4835,6 +5095,16 @@
         <w:t>b) Por volta de 2 anos</w:t>
       </w:r>
       <w:r>
+        <w:rPr>
+          <w:rFonts w:ascii="Aptos" w:hAnsi="Aptos" w:eastAsia="Aptos" w:cs="Aptos"/>
+          <w:noProof w:val="0"/>
+          <w:sz w:val="24"/>
+          <w:szCs w:val="24"/>
+          <w:lang w:val="pt-BR"/>
+        </w:rPr>
+        <w:t>.</w:t>
+      </w:r>
+      <w:r>
         <w:br/>
       </w:r>
       <w:r>
@@ -4845,7 +5115,27 @@
           <w:szCs w:val="24"/>
           <w:lang w:val="pt-BR"/>
         </w:rPr>
-        <w:t xml:space="preserve">c) Entre 4 e 5 anos </w:t>
+        <w:t>c) Entre 4 e 5 anos</w:t>
+      </w:r>
+      <w:r>
+        <w:rPr>
+          <w:rFonts w:ascii="Aptos" w:hAnsi="Aptos" w:eastAsia="Aptos" w:cs="Aptos"/>
+          <w:noProof w:val="0"/>
+          <w:sz w:val="24"/>
+          <w:szCs w:val="24"/>
+          <w:lang w:val="pt-BR"/>
+        </w:rPr>
+        <w:t>.</w:t>
+      </w:r>
+      <w:r>
+        <w:rPr>
+          <w:rFonts w:ascii="Aptos" w:hAnsi="Aptos" w:eastAsia="Aptos" w:cs="Aptos"/>
+          <w:noProof w:val="0"/>
+          <w:sz w:val="24"/>
+          <w:szCs w:val="24"/>
+          <w:lang w:val="pt-BR"/>
+        </w:rPr>
+        <w:t xml:space="preserve"> </w:t>
       </w:r>
       <w:r>
         <w:rPr>
@@ -4872,6 +5162,16 @@
         </w:rPr>
         <w:t>d) Somente depois dos 6 anos</w:t>
       </w:r>
+      <w:r>
+        <w:rPr>
+          <w:rFonts w:ascii="Aptos" w:hAnsi="Aptos" w:eastAsia="Aptos" w:cs="Aptos"/>
+          <w:noProof w:val="0"/>
+          <w:sz w:val="24"/>
+          <w:szCs w:val="24"/>
+          <w:lang w:val="pt-BR"/>
+        </w:rPr>
+        <w:t>.</w:t>
+      </w:r>
     </w:p>
     <w:p>
       <w:pPr>
@@ -4973,6 +5273,16 @@
         <w:t>a) Apenas garantir alimentação e proteção física</w:t>
       </w:r>
       <w:r>
+        <w:rPr>
+          <w:rFonts w:ascii="Aptos" w:hAnsi="Aptos" w:eastAsia="Aptos" w:cs="Aptos"/>
+          <w:noProof w:val="0"/>
+          <w:sz w:val="24"/>
+          <w:szCs w:val="24"/>
+          <w:lang w:val="pt-BR"/>
+        </w:rPr>
+        <w:t>.</w:t>
+      </w:r>
+      <w:r>
         <w:br/>
       </w:r>
       <w:r>
@@ -4986,6 +5296,16 @@
         <w:t>b) Principalmente ensinar regras e comportamentos</w:t>
       </w:r>
       <w:r>
+        <w:rPr>
+          <w:rFonts w:ascii="Aptos" w:hAnsi="Aptos" w:eastAsia="Aptos" w:cs="Aptos"/>
+          <w:noProof w:val="0"/>
+          <w:sz w:val="24"/>
+          <w:szCs w:val="24"/>
+          <w:lang w:val="pt-BR"/>
+        </w:rPr>
+        <w:t>.</w:t>
+      </w:r>
+      <w:r>
         <w:br/>
       </w:r>
       <w:r>
@@ -4996,7 +5316,27 @@
           <w:szCs w:val="24"/>
           <w:lang w:val="pt-BR"/>
         </w:rPr>
-        <w:t xml:space="preserve">c) Oferecer relações afetivas, escuta, oportunidades de brincar e segurança </w:t>
+        <w:t>c) Oferecer relações afetivas, escuta, oportunidades de brincar e segurança</w:t>
+      </w:r>
+      <w:r>
+        <w:rPr>
+          <w:rFonts w:ascii="Aptos" w:hAnsi="Aptos" w:eastAsia="Aptos" w:cs="Aptos"/>
+          <w:noProof w:val="0"/>
+          <w:sz w:val="24"/>
+          <w:szCs w:val="24"/>
+          <w:lang w:val="pt-BR"/>
+        </w:rPr>
+        <w:t>.</w:t>
+      </w:r>
+      <w:r>
+        <w:rPr>
+          <w:rFonts w:ascii="Aptos" w:hAnsi="Aptos" w:eastAsia="Aptos" w:cs="Aptos"/>
+          <w:noProof w:val="0"/>
+          <w:sz w:val="24"/>
+          <w:szCs w:val="24"/>
+          <w:lang w:val="pt-BR"/>
+        </w:rPr>
+        <w:t xml:space="preserve"> </w:t>
       </w:r>
       <w:r>
         <w:rPr>
@@ -5023,6 +5363,16 @@
         </w:rPr>
         <w:t>d) Controlar todas as experiências da criança para evitar riscos</w:t>
       </w:r>
+      <w:r>
+        <w:rPr>
+          <w:rFonts w:ascii="Aptos" w:hAnsi="Aptos" w:eastAsia="Aptos" w:cs="Aptos"/>
+          <w:noProof w:val="0"/>
+          <w:sz w:val="24"/>
+          <w:szCs w:val="24"/>
+          <w:lang w:val="pt-BR"/>
+        </w:rPr>
+        <w:t>.</w:t>
+      </w:r>
     </w:p>
     <w:p>
       <w:pPr>
@@ -5124,6 +5474,16 @@
         <w:t>a) Todas as crianças devem atingir as mesmas conquistas exatamente na mesma idade</w:t>
       </w:r>
       <w:r>
+        <w:rPr>
+          <w:rFonts w:ascii="Aptos" w:hAnsi="Aptos" w:eastAsia="Aptos" w:cs="Aptos"/>
+          <w:noProof w:val="0"/>
+          <w:sz w:val="24"/>
+          <w:szCs w:val="24"/>
+          <w:lang w:val="pt-BR"/>
+        </w:rPr>
+        <w:t>.</w:t>
+      </w:r>
+      <w:r>
         <w:br/>
       </w:r>
       <w:r>
@@ -5137,6 +5497,16 @@
         <w:t>b) O desenvolvimento acontece da mesma maneira para todas as crianças</w:t>
       </w:r>
       <w:r>
+        <w:rPr>
+          <w:rFonts w:ascii="Aptos" w:hAnsi="Aptos" w:eastAsia="Aptos" w:cs="Aptos"/>
+          <w:noProof w:val="0"/>
+          <w:sz w:val="24"/>
+          <w:szCs w:val="24"/>
+          <w:lang w:val="pt-BR"/>
+        </w:rPr>
+        <w:t>.</w:t>
+      </w:r>
+      <w:r>
         <w:br/>
       </w:r>
       <w:r>
@@ -5147,7 +5517,27 @@
           <w:szCs w:val="24"/>
           <w:lang w:val="pt-BR"/>
         </w:rPr>
-        <w:t xml:space="preserve">c) Cada criança tem seu próprio percurso de desenvolvimento, influenciado também pelo contexto em que vive </w:t>
+        <w:t>c) Cada criança tem seu próprio percurso de desenvolvimento, influenciado também pelo contexto em que vive</w:t>
+      </w:r>
+      <w:r>
+        <w:rPr>
+          <w:rFonts w:ascii="Aptos" w:hAnsi="Aptos" w:eastAsia="Aptos" w:cs="Aptos"/>
+          <w:noProof w:val="0"/>
+          <w:sz w:val="24"/>
+          <w:szCs w:val="24"/>
+          <w:lang w:val="pt-BR"/>
+        </w:rPr>
+        <w:t>.</w:t>
+      </w:r>
+      <w:r>
+        <w:rPr>
+          <w:rFonts w:ascii="Aptos" w:hAnsi="Aptos" w:eastAsia="Aptos" w:cs="Aptos"/>
+          <w:noProof w:val="0"/>
+          <w:sz w:val="24"/>
+          <w:szCs w:val="24"/>
+          <w:lang w:val="pt-BR"/>
+        </w:rPr>
+        <w:t xml:space="preserve"> </w:t>
       </w:r>
       <w:r>
         <w:rPr>
@@ -5174,6 +5564,16 @@
         </w:rPr>
         <w:t>d) O ambiente e as relações têm pouca influência sobre o desenvolvimento</w:t>
       </w:r>
+      <w:r>
+        <w:rPr>
+          <w:rFonts w:ascii="Aptos" w:hAnsi="Aptos" w:eastAsia="Aptos" w:cs="Aptos"/>
+          <w:noProof w:val="0"/>
+          <w:sz w:val="24"/>
+          <w:szCs w:val="24"/>
+          <w:lang w:val="pt-BR"/>
+        </w:rPr>
+        <w:t>.</w:t>
+      </w:r>
     </w:p>
     <w:p>
       <w:pPr>
@@ -5265,6 +5665,3327 @@
         <w:rPr>
           <w:rFonts w:ascii="Aptos" w:hAnsi="Aptos" w:eastAsia="Aptos" w:cs="Aptos"/>
           <w:noProof w:val="0"/>
+          <w:sz w:val="24"/>
+          <w:szCs w:val="24"/>
+          <w:lang w:val="pt-BR"/>
+        </w:rPr>
+      </w:pPr>
+    </w:p>
+    <w:p>
+      <w:pPr>
+        <w:pStyle w:val="Normal"/>
+        <w:rPr>
+          <w:rFonts w:ascii="Aptos" w:hAnsi="Aptos" w:eastAsia="Aptos" w:cs="Aptos"/>
+          <w:noProof w:val="0"/>
+          <w:sz w:val="24"/>
+          <w:szCs w:val="24"/>
+          <w:lang w:val="pt-BR"/>
+        </w:rPr>
+      </w:pPr>
+    </w:p>
+    <w:p>
+      <w:pPr>
+        <w:pStyle w:val="Normal"/>
+      </w:pPr>
+      <w:r>
+        <w:rPr>
+          <w:rFonts w:ascii="Aptos" w:hAnsi="Aptos" w:eastAsia="Aptos" w:cs="Aptos"/>
+          <w:noProof w:val="0"/>
+          <w:color w:val="FF0000"/>
+          <w:sz w:val="24"/>
+          <w:szCs w:val="24"/>
+          <w:highlight w:val="yellow"/>
+          <w:lang w:val="pt-BR"/>
+        </w:rPr>
+        <w:t>*** Atualizado no Moodle até aqui</w:t>
+      </w:r>
+      <w:r>
+        <w:rPr>
+          <w:rFonts w:ascii="Aptos" w:hAnsi="Aptos" w:eastAsia="Aptos" w:cs="Aptos"/>
+          <w:noProof w:val="0"/>
+          <w:color w:val="FF0000"/>
+          <w:sz w:val="24"/>
+          <w:szCs w:val="24"/>
+          <w:highlight w:val="yellow"/>
+          <w:lang w:val="pt-BR"/>
+        </w:rPr>
+        <w:t xml:space="preserve"> ***</w:t>
+      </w:r>
+    </w:p>
+    <w:p>
+      <w:pPr>
+        <w:pStyle w:val="Normal"/>
+        <w:rPr>
+          <w:rFonts w:ascii="Aptos" w:hAnsi="Aptos" w:eastAsia="Aptos" w:cs="Aptos"/>
+          <w:noProof w:val="0"/>
+          <w:color w:val="auto"/>
+          <w:sz w:val="24"/>
+          <w:szCs w:val="24"/>
+          <w:lang w:val="pt-BR"/>
+        </w:rPr>
+      </w:pPr>
+    </w:p>
+    <w:p>
+      <w:pPr>
+        <w:pStyle w:val="Normal"/>
+      </w:pPr>
+      <w:r>
+        <w:rPr>
+          <w:rFonts w:ascii="Aptos" w:hAnsi="Aptos" w:eastAsia="Aptos" w:cs="Aptos"/>
+          <w:noProof w:val="0"/>
+          <w:color w:val="auto"/>
+          <w:sz w:val="24"/>
+          <w:szCs w:val="24"/>
+          <w:lang w:val="pt-BR"/>
+        </w:rPr>
+        <w:t>[Continuar daqui]</w:t>
+      </w:r>
+    </w:p>
+    <w:p>
+      <w:pPr>
+        <w:pStyle w:val="Normal"/>
+        <w:rPr>
+          <w:rFonts w:ascii="Aptos" w:hAnsi="Aptos" w:eastAsia="Aptos" w:cs="Aptos"/>
+          <w:noProof w:val="0"/>
+          <w:color w:val="auto"/>
+          <w:sz w:val="24"/>
+          <w:szCs w:val="24"/>
+          <w:lang w:val="pt-BR"/>
+        </w:rPr>
+      </w:pPr>
+    </w:p>
+    <w:p>
+      <w:pPr>
+        <w:pStyle w:val="Heading1"/>
+        <w:suppressLineNumbers w:val="0"/>
+        <w:bidi w:val="0"/>
+        <w:spacing w:before="360" w:beforeAutospacing="off" w:after="80" w:afterAutospacing="off" w:line="279" w:lineRule="auto"/>
+        <w:ind w:left="0" w:right="0"/>
+        <w:jc w:val="left"/>
+      </w:pPr>
+      <w:r>
+        <w:rPr>
+          <w:noProof w:val="0"/>
+          <w:lang w:val="pt-BR"/>
+        </w:rPr>
+        <w:t xml:space="preserve">Solicitações de ajustes – Parte 3: </w:t>
+      </w:r>
+      <w:r>
+        <w:rPr>
+          <w:noProof w:val="0"/>
+          <w:lang w:val="pt-BR"/>
+        </w:rPr>
+        <w:t>Infâncias no plural: contextos e desigualdade</w:t>
+      </w:r>
+    </w:p>
+    <w:p>
+      <w:pPr>
+        <w:pStyle w:val="Normal"/>
+        <w:bidi w:val="0"/>
+        <w:rPr>
+          <w:noProof w:val="0"/>
+          <w:lang w:val="pt-BR"/>
+        </w:rPr>
+      </w:pPr>
+    </w:p>
+    <w:p>
+      <w:pPr>
+        <w:pStyle w:val="Normal"/>
+        <w:bidi w:val="0"/>
+      </w:pPr>
+      <w:r>
+        <w:rPr>
+          <w:noProof w:val="0"/>
+          <w:sz w:val="28"/>
+          <w:szCs w:val="28"/>
+          <w:lang w:val="pt-BR"/>
+        </w:rPr>
+        <w:t xml:space="preserve">Lição 1: </w:t>
+      </w:r>
+      <w:r>
+        <w:rPr>
+          <w:noProof w:val="0"/>
+          <w:sz w:val="28"/>
+          <w:szCs w:val="28"/>
+          <w:lang w:val="pt-BR"/>
+        </w:rPr>
+        <w:t>Desigualdades</w:t>
+      </w:r>
+      <w:r>
+        <w:rPr>
+          <w:noProof w:val="0"/>
+          <w:sz w:val="28"/>
+          <w:szCs w:val="28"/>
+          <w:lang w:val="pt-BR"/>
+        </w:rPr>
+        <w:t xml:space="preserve"> e Redes de Proteção</w:t>
+      </w:r>
+    </w:p>
+    <w:p>
+      <w:pPr>
+        <w:pStyle w:val="Normal"/>
+        <w:bidi w:val="0"/>
+        <w:rPr>
+          <w:noProof w:val="0"/>
+          <w:sz w:val="28"/>
+          <w:szCs w:val="28"/>
+          <w:lang w:val="pt-BR"/>
+        </w:rPr>
+      </w:pPr>
+    </w:p>
+    <w:p>
+      <w:pPr>
+        <w:bidi w:val="0"/>
+        <w:spacing w:before="240" w:beforeAutospacing="off" w:after="240" w:afterAutospacing="off"/>
+      </w:pPr>
+      <w:r>
+        <w:rPr>
+          <w:rFonts w:ascii="Aptos" w:hAnsi="Aptos" w:eastAsia="Aptos" w:cs="Aptos"/>
+          <w:b w:val="1"/>
+          <w:bCs w:val="1"/>
+          <w:noProof w:val="0"/>
+          <w:sz w:val="24"/>
+          <w:szCs w:val="24"/>
+          <w:lang w:val="pt-BR"/>
+        </w:rPr>
+        <w:t>1. Título da lição 1</w:t>
+      </w:r>
+    </w:p>
+    <w:p>
+      <w:pPr>
+        <w:bidi w:val="0"/>
+        <w:spacing w:before="240" w:beforeAutospacing="off" w:after="240" w:afterAutospacing="off"/>
+      </w:pPr>
+      <w:r>
+        <w:rPr>
+          <w:rFonts w:ascii="Aptos" w:hAnsi="Aptos" w:eastAsia="Aptos" w:cs="Aptos"/>
+          <w:noProof w:val="0"/>
+          <w:sz w:val="24"/>
+          <w:szCs w:val="24"/>
+          <w:lang w:val="pt-BR"/>
+        </w:rPr>
+        <w:t xml:space="preserve">Alterar o título da lição de </w:t>
+      </w:r>
+      <w:r>
+        <w:rPr>
+          <w:rFonts w:ascii="Aptos" w:hAnsi="Aptos" w:eastAsia="Aptos" w:cs="Aptos"/>
+          <w:b w:val="1"/>
+          <w:bCs w:val="1"/>
+          <w:noProof w:val="0"/>
+          <w:sz w:val="24"/>
+          <w:szCs w:val="24"/>
+          <w:lang w:val="pt-BR"/>
+        </w:rPr>
+        <w:t>“Desigualdade</w:t>
+      </w:r>
+      <w:r>
+        <w:rPr>
+          <w:rFonts w:ascii="Aptos" w:hAnsi="Aptos" w:eastAsia="Aptos" w:cs="Aptos"/>
+          <w:b w:val="1"/>
+          <w:bCs w:val="1"/>
+          <w:noProof w:val="0"/>
+          <w:sz w:val="24"/>
+          <w:szCs w:val="24"/>
+          <w:highlight w:val="yellow"/>
+          <w:lang w:val="pt-BR"/>
+        </w:rPr>
+        <w:t>s</w:t>
+      </w:r>
+      <w:r>
+        <w:rPr>
+          <w:rFonts w:ascii="Aptos" w:hAnsi="Aptos" w:eastAsia="Aptos" w:cs="Aptos"/>
+          <w:b w:val="1"/>
+          <w:bCs w:val="1"/>
+          <w:noProof w:val="0"/>
+          <w:sz w:val="24"/>
+          <w:szCs w:val="24"/>
+          <w:lang w:val="pt-BR"/>
+        </w:rPr>
+        <w:t xml:space="preserve"> e Redes de Proteção”</w:t>
+      </w:r>
+      <w:r>
+        <w:rPr>
+          <w:rFonts w:ascii="Aptos" w:hAnsi="Aptos" w:eastAsia="Aptos" w:cs="Aptos"/>
+          <w:noProof w:val="0"/>
+          <w:sz w:val="24"/>
+          <w:szCs w:val="24"/>
+          <w:lang w:val="pt-BR"/>
+        </w:rPr>
+        <w:t xml:space="preserve"> para: </w:t>
+      </w:r>
+      <w:r>
+        <w:rPr>
+          <w:rFonts w:ascii="Aptos" w:hAnsi="Aptos" w:eastAsia="Aptos" w:cs="Aptos"/>
+          <w:b w:val="1"/>
+          <w:bCs w:val="1"/>
+          <w:noProof w:val="0"/>
+          <w:sz w:val="24"/>
+          <w:szCs w:val="24"/>
+          <w:lang w:val="pt-BR"/>
+        </w:rPr>
+        <w:t>Desigualdade e Redes de Proteção</w:t>
+      </w:r>
+    </w:p>
+    <w:p>
+      <w:pPr>
+        <w:pStyle w:val="Normal"/>
+        <w:suppressLineNumbers w:val="0"/>
+        <w:bidi w:val="0"/>
+        <w:spacing w:before="240" w:beforeAutospacing="off" w:after="240" w:afterAutospacing="off" w:line="279" w:lineRule="auto"/>
+        <w:ind w:left="0" w:right="0"/>
+        <w:jc w:val="left"/>
+        <w:rPr>
+          <w:rFonts w:ascii="Aptos" w:hAnsi="Aptos" w:eastAsia="Aptos" w:cs="Aptos"/>
+          <w:b w:val="1"/>
+          <w:bCs w:val="1"/>
+          <w:noProof w:val="0"/>
+          <w:sz w:val="24"/>
+          <w:szCs w:val="24"/>
+          <w:lang w:val="pt-BR"/>
+        </w:rPr>
+      </w:pPr>
+    </w:p>
+    <w:p>
+      <w:pPr>
+        <w:pStyle w:val="Normal"/>
+        <w:suppressLineNumbers w:val="0"/>
+        <w:bidi w:val="0"/>
+        <w:spacing w:before="240" w:beforeAutospacing="off" w:after="240" w:afterAutospacing="off" w:line="279" w:lineRule="auto"/>
+        <w:ind w:left="0" w:right="0"/>
+        <w:jc w:val="left"/>
+      </w:pPr>
+      <w:r>
+        <w:rPr>
+          <w:rFonts w:ascii="Aptos" w:hAnsi="Aptos" w:eastAsia="Aptos" w:cs="Aptos"/>
+          <w:b w:val="1"/>
+          <w:bCs w:val="1"/>
+          <w:noProof w:val="0"/>
+          <w:sz w:val="24"/>
+          <w:szCs w:val="24"/>
+          <w:lang w:val="pt-BR"/>
+        </w:rPr>
+        <w:t>2. Título da página 1 da lição 1</w:t>
+      </w:r>
+    </w:p>
+    <w:p>
+      <w:pPr>
+        <w:pStyle w:val="Normal"/>
+        <w:suppressLineNumbers w:val="0"/>
+        <w:bidi w:val="0"/>
+        <w:spacing w:before="240" w:beforeAutospacing="off" w:after="240" w:afterAutospacing="off" w:line="279" w:lineRule="auto"/>
+        <w:ind w:left="0" w:right="0"/>
+        <w:jc w:val="left"/>
+        <w:rPr>
+          <w:rFonts w:ascii="Aptos" w:hAnsi="Aptos" w:eastAsia="Aptos" w:cs="Aptos"/>
+          <w:b w:val="1"/>
+          <w:bCs w:val="1"/>
+          <w:noProof w:val="0"/>
+          <w:sz w:val="24"/>
+          <w:szCs w:val="24"/>
+          <w:lang w:val="pt-BR"/>
+        </w:rPr>
+      </w:pPr>
+      <w:r>
+        <w:rPr>
+          <w:rFonts w:ascii="Aptos" w:hAnsi="Aptos" w:eastAsia="Aptos" w:cs="Aptos"/>
+          <w:noProof w:val="0"/>
+          <w:sz w:val="24"/>
+          <w:szCs w:val="24"/>
+          <w:lang w:val="pt-BR"/>
+        </w:rPr>
+        <w:t xml:space="preserve">Substituir o título O Cenário da Desigualdade por: </w:t>
+      </w:r>
+      <w:r>
+        <w:rPr>
+          <w:rFonts w:ascii="Aptos" w:hAnsi="Aptos" w:eastAsia="Aptos" w:cs="Aptos"/>
+          <w:b w:val="1"/>
+          <w:bCs w:val="1"/>
+          <w:noProof w:val="0"/>
+          <w:sz w:val="24"/>
+          <w:szCs w:val="24"/>
+          <w:lang w:val="pt-BR"/>
+        </w:rPr>
+        <w:t xml:space="preserve">Um cenário de desigualdade </w:t>
+      </w:r>
+    </w:p>
+    <w:p>
+      <w:pPr>
+        <w:pStyle w:val="Normal"/>
+        <w:bidi w:val="0"/>
+        <w:spacing w:before="240" w:beforeAutospacing="off" w:after="240" w:afterAutospacing="off"/>
+      </w:pPr>
+      <w:r>
+        <w:rPr>
+          <w:rFonts w:ascii="Aptos" w:hAnsi="Aptos" w:eastAsia="Aptos" w:cs="Aptos"/>
+          <w:noProof w:val="0"/>
+          <w:sz w:val="24"/>
+          <w:szCs w:val="24"/>
+          <w:lang w:val="pt-BR"/>
+        </w:rPr>
+        <w:t xml:space="preserve">Deixar as palavras </w:t>
+      </w:r>
+      <w:r>
+        <w:rPr>
+          <w:rFonts w:ascii="Aptos" w:hAnsi="Aptos" w:eastAsia="Aptos" w:cs="Aptos"/>
+          <w:b w:val="1"/>
+          <w:bCs w:val="1"/>
+          <w:noProof w:val="0"/>
+          <w:sz w:val="24"/>
+          <w:szCs w:val="24"/>
+          <w:lang w:val="pt-BR"/>
+        </w:rPr>
+        <w:t>“cenário”</w:t>
+      </w:r>
+      <w:r>
+        <w:rPr>
+          <w:rFonts w:ascii="Aptos" w:hAnsi="Aptos" w:eastAsia="Aptos" w:cs="Aptos"/>
+          <w:noProof w:val="0"/>
+          <w:sz w:val="24"/>
+          <w:szCs w:val="24"/>
+          <w:lang w:val="pt-BR"/>
+        </w:rPr>
+        <w:t xml:space="preserve"> e </w:t>
+      </w:r>
+      <w:r>
+        <w:rPr>
+          <w:rFonts w:ascii="Aptos" w:hAnsi="Aptos" w:eastAsia="Aptos" w:cs="Aptos"/>
+          <w:b w:val="1"/>
+          <w:bCs w:val="1"/>
+          <w:noProof w:val="0"/>
+          <w:sz w:val="24"/>
+          <w:szCs w:val="24"/>
+          <w:lang w:val="pt-BR"/>
+        </w:rPr>
+        <w:t>“desigualdade”</w:t>
+      </w:r>
+      <w:r>
+        <w:rPr>
+          <w:rFonts w:ascii="Aptos" w:hAnsi="Aptos" w:eastAsia="Aptos" w:cs="Aptos"/>
+          <w:noProof w:val="0"/>
+          <w:sz w:val="24"/>
+          <w:szCs w:val="24"/>
+          <w:lang w:val="pt-BR"/>
+        </w:rPr>
+        <w:t xml:space="preserve"> iniciadas com letra minúscula.</w:t>
+      </w:r>
+    </w:p>
+    <w:p>
+      <w:pPr>
+        <w:bidi w:val="0"/>
+        <w:spacing w:before="240" w:beforeAutospacing="off" w:after="240" w:afterAutospacing="off"/>
+        <w:rPr>
+          <w:rFonts w:ascii="Aptos" w:hAnsi="Aptos" w:eastAsia="Aptos" w:cs="Aptos"/>
+          <w:b w:val="1"/>
+          <w:bCs w:val="1"/>
+          <w:noProof w:val="0"/>
+          <w:sz w:val="24"/>
+          <w:szCs w:val="24"/>
+          <w:lang w:val="pt-BR"/>
+        </w:rPr>
+      </w:pPr>
+    </w:p>
+    <w:p>
+      <w:pPr>
+        <w:bidi w:val="0"/>
+        <w:spacing w:before="240" w:beforeAutospacing="off" w:after="240" w:afterAutospacing="off"/>
+      </w:pPr>
+      <w:r>
+        <w:rPr>
+          <w:rFonts w:ascii="Aptos" w:hAnsi="Aptos" w:eastAsia="Aptos" w:cs="Aptos"/>
+          <w:b w:val="1"/>
+          <w:bCs w:val="1"/>
+          <w:noProof w:val="0"/>
+          <w:sz w:val="24"/>
+          <w:szCs w:val="24"/>
+          <w:lang w:val="pt-BR"/>
+        </w:rPr>
+        <w:t>2. Padronização de “Primeira Infância”</w:t>
+      </w:r>
+    </w:p>
+    <w:p>
+      <w:pPr>
+        <w:bidi w:val="0"/>
+        <w:spacing w:before="240" w:beforeAutospacing="off" w:after="240" w:afterAutospacing="off"/>
+      </w:pPr>
+      <w:r>
+        <w:rPr>
+          <w:rFonts w:ascii="Aptos" w:hAnsi="Aptos" w:eastAsia="Aptos" w:cs="Aptos"/>
+          <w:noProof w:val="0"/>
+          <w:sz w:val="24"/>
+          <w:szCs w:val="24"/>
+          <w:lang w:val="pt-BR"/>
+        </w:rPr>
+        <w:t xml:space="preserve">No primeiro </w:t>
+      </w:r>
+      <w:r>
+        <w:rPr>
+          <w:rFonts w:ascii="Aptos" w:hAnsi="Aptos" w:eastAsia="Aptos" w:cs="Aptos"/>
+          <w:noProof w:val="0"/>
+          <w:sz w:val="24"/>
+          <w:szCs w:val="24"/>
+          <w:lang w:val="pt-BR"/>
+        </w:rPr>
+        <w:t xml:space="preserve">e no último </w:t>
+      </w:r>
+      <w:r>
+        <w:rPr>
+          <w:rFonts w:ascii="Aptos" w:hAnsi="Aptos" w:eastAsia="Aptos" w:cs="Aptos"/>
+          <w:noProof w:val="0"/>
+          <w:sz w:val="24"/>
+          <w:szCs w:val="24"/>
+          <w:lang w:val="pt-BR"/>
+        </w:rPr>
+        <w:t xml:space="preserve">parágrafo do conteúdo, alterar a expressão </w:t>
+      </w:r>
+      <w:r>
+        <w:rPr>
+          <w:rFonts w:ascii="Aptos" w:hAnsi="Aptos" w:eastAsia="Aptos" w:cs="Aptos"/>
+          <w:b w:val="1"/>
+          <w:bCs w:val="1"/>
+          <w:noProof w:val="0"/>
+          <w:sz w:val="24"/>
+          <w:szCs w:val="24"/>
+          <w:lang w:val="pt-BR"/>
+        </w:rPr>
+        <w:t>“primeira infância”</w:t>
+      </w:r>
+      <w:r>
+        <w:rPr>
+          <w:rFonts w:ascii="Aptos" w:hAnsi="Aptos" w:eastAsia="Aptos" w:cs="Aptos"/>
+          <w:noProof w:val="0"/>
+          <w:sz w:val="24"/>
+          <w:szCs w:val="24"/>
+          <w:lang w:val="pt-BR"/>
+        </w:rPr>
+        <w:t xml:space="preserve"> para </w:t>
+      </w:r>
+      <w:r>
+        <w:rPr>
+          <w:rFonts w:ascii="Aptos" w:hAnsi="Aptos" w:eastAsia="Aptos" w:cs="Aptos"/>
+          <w:b w:val="1"/>
+          <w:bCs w:val="1"/>
+          <w:noProof w:val="0"/>
+          <w:sz w:val="24"/>
+          <w:szCs w:val="24"/>
+          <w:lang w:val="pt-BR"/>
+        </w:rPr>
+        <w:t>“Primeira Infância”</w:t>
+      </w:r>
+      <w:r>
+        <w:rPr>
+          <w:rFonts w:ascii="Aptos" w:hAnsi="Aptos" w:eastAsia="Aptos" w:cs="Aptos"/>
+          <w:noProof w:val="0"/>
+          <w:sz w:val="24"/>
+          <w:szCs w:val="24"/>
+          <w:lang w:val="pt-BR"/>
+        </w:rPr>
+        <w:t>, com as iniciais em letras maiúsculas.</w:t>
+      </w:r>
+    </w:p>
+    <w:p>
+      <w:pPr>
+        <w:pStyle w:val="Normal"/>
+        <w:suppressLineNumbers w:val="0"/>
+        <w:bidi w:val="0"/>
+        <w:spacing w:before="240" w:beforeAutospacing="off" w:after="240" w:afterAutospacing="off" w:line="279" w:lineRule="auto"/>
+        <w:ind w:left="0" w:right="0"/>
+        <w:jc w:val="left"/>
+        <w:rPr>
+          <w:rFonts w:ascii="Aptos" w:hAnsi="Aptos" w:eastAsia="Aptos" w:cs="Aptos"/>
+          <w:b w:val="1"/>
+          <w:bCs w:val="1"/>
+          <w:noProof w:val="0"/>
+          <w:sz w:val="24"/>
+          <w:szCs w:val="24"/>
+          <w:lang w:val="pt-BR"/>
+        </w:rPr>
+      </w:pPr>
+    </w:p>
+    <w:p>
+      <w:pPr>
+        <w:pStyle w:val="Normal"/>
+        <w:suppressLineNumbers w:val="0"/>
+        <w:bidi w:val="0"/>
+        <w:spacing w:before="240" w:beforeAutospacing="off" w:after="240" w:afterAutospacing="off" w:line="279" w:lineRule="auto"/>
+        <w:ind w:left="0" w:right="0"/>
+        <w:jc w:val="left"/>
+      </w:pPr>
+      <w:r>
+        <w:rPr>
+          <w:rFonts w:ascii="Aptos" w:hAnsi="Aptos" w:eastAsia="Aptos" w:cs="Aptos"/>
+          <w:b w:val="1"/>
+          <w:bCs w:val="1"/>
+          <w:noProof w:val="0"/>
+          <w:sz w:val="24"/>
+          <w:szCs w:val="24"/>
+          <w:lang w:val="pt-BR"/>
+        </w:rPr>
+        <w:t>3</w:t>
+      </w:r>
+      <w:r>
+        <w:rPr>
+          <w:rFonts w:ascii="Aptos" w:hAnsi="Aptos" w:eastAsia="Aptos" w:cs="Aptos"/>
+          <w:b w:val="1"/>
+          <w:bCs w:val="1"/>
+          <w:noProof w:val="0"/>
+          <w:sz w:val="24"/>
+          <w:szCs w:val="24"/>
+          <w:lang w:val="pt-BR"/>
+        </w:rPr>
+        <w:t>. Box sobre vulnerabilidade socioeconômica</w:t>
+      </w:r>
+    </w:p>
+    <w:p>
+      <w:pPr>
+        <w:pStyle w:val="Normal"/>
+        <w:suppressLineNumbers w:val="0"/>
+        <w:bidi w:val="0"/>
+        <w:spacing w:before="240" w:beforeAutospacing="off" w:after="240" w:afterAutospacing="off" w:line="279" w:lineRule="auto"/>
+        <w:ind w:left="0" w:right="0"/>
+        <w:jc w:val="left"/>
+      </w:pPr>
+      <w:r>
+        <w:rPr>
+          <w:rFonts w:ascii="Aptos" w:hAnsi="Aptos" w:eastAsia="Aptos" w:cs="Aptos"/>
+          <w:noProof w:val="0"/>
+          <w:sz w:val="24"/>
+          <w:szCs w:val="24"/>
+          <w:lang w:val="pt-BR"/>
+        </w:rPr>
+        <w:t>Alterar o título e o conteúdo do box para:</w:t>
+      </w:r>
+    </w:p>
+    <w:p>
+      <w:pPr>
+        <w:bidi w:val="0"/>
+        <w:spacing w:before="240" w:beforeAutospacing="off" w:after="240" w:afterAutospacing="off"/>
+      </w:pPr>
+      <w:r>
+        <w:rPr>
+          <w:rFonts w:ascii="Aptos" w:hAnsi="Aptos" w:eastAsia="Aptos" w:cs="Aptos"/>
+          <w:b w:val="1"/>
+          <w:bCs w:val="1"/>
+          <w:noProof w:val="0"/>
+          <w:sz w:val="24"/>
+          <w:szCs w:val="24"/>
+          <w:lang w:val="pt-BR"/>
+        </w:rPr>
+        <w:t xml:space="preserve">[título] </w:t>
+      </w:r>
+      <w:r>
+        <w:rPr>
+          <w:rFonts w:ascii="Aptos" w:hAnsi="Aptos" w:eastAsia="Aptos" w:cs="Aptos"/>
+          <w:b w:val="1"/>
+          <w:bCs w:val="1"/>
+          <w:noProof w:val="0"/>
+          <w:sz w:val="24"/>
+          <w:szCs w:val="24"/>
+          <w:lang w:val="pt-BR"/>
+        </w:rPr>
+        <w:t>Você sabe o que é vulnerabilidade socioeconômica?</w:t>
+      </w:r>
+    </w:p>
+    <w:p>
+      <w:pPr>
+        <w:bidi w:val="0"/>
+        <w:spacing w:before="240" w:beforeAutospacing="off" w:after="240" w:afterAutospacing="off"/>
+      </w:pPr>
+      <w:r>
+        <w:rPr>
+          <w:rFonts w:ascii="Aptos" w:hAnsi="Aptos" w:eastAsia="Aptos" w:cs="Aptos"/>
+          <w:noProof w:val="0"/>
+          <w:sz w:val="24"/>
+          <w:szCs w:val="24"/>
+          <w:lang w:val="pt-BR"/>
+        </w:rPr>
+        <w:t>Este termo refere-se a situações de fragilidade social e econômica que dificultam o acesso a direitos básicos e a oportunidades.</w:t>
+      </w:r>
+    </w:p>
+    <w:p>
+      <w:pPr>
+        <w:bidi w:val="0"/>
+        <w:spacing w:before="240" w:beforeAutospacing="off" w:after="240" w:afterAutospacing="off"/>
+      </w:pPr>
+      <w:r>
+        <w:rPr>
+          <w:rFonts w:ascii="Aptos" w:hAnsi="Aptos" w:eastAsia="Aptos" w:cs="Aptos"/>
+          <w:noProof w:val="0"/>
+          <w:sz w:val="24"/>
+          <w:szCs w:val="24"/>
+          <w:lang w:val="pt-BR"/>
+        </w:rPr>
+        <w:t xml:space="preserve">Retirar o </w:t>
+      </w:r>
+      <w:r>
+        <w:rPr>
+          <w:rFonts w:ascii="Aptos" w:hAnsi="Aptos" w:eastAsia="Aptos" w:cs="Aptos"/>
+          <w:b w:val="1"/>
+          <w:bCs w:val="1"/>
+          <w:noProof w:val="0"/>
+          <w:sz w:val="24"/>
+          <w:szCs w:val="24"/>
+          <w:lang w:val="pt-BR"/>
+        </w:rPr>
+        <w:t>ícone de informação</w:t>
+      </w:r>
+      <w:r>
+        <w:rPr>
+          <w:rFonts w:ascii="Aptos" w:hAnsi="Aptos" w:eastAsia="Aptos" w:cs="Aptos"/>
+          <w:noProof w:val="0"/>
+          <w:sz w:val="24"/>
+          <w:szCs w:val="24"/>
+          <w:lang w:val="pt-BR"/>
+        </w:rPr>
+        <w:t xml:space="preserve"> do box de texto.</w:t>
+      </w:r>
+    </w:p>
+    <w:p>
+      <w:pPr>
+        <w:pStyle w:val="Normal"/>
+        <w:suppressLineNumbers w:val="0"/>
+        <w:bidi w:val="0"/>
+        <w:spacing w:before="240" w:beforeAutospacing="off" w:after="240" w:afterAutospacing="off" w:line="279" w:lineRule="auto"/>
+        <w:ind w:left="0" w:right="0"/>
+        <w:jc w:val="left"/>
+        <w:rPr>
+          <w:rFonts w:ascii="Aptos" w:hAnsi="Aptos" w:eastAsia="Aptos" w:cs="Aptos"/>
+          <w:b w:val="1"/>
+          <w:bCs w:val="1"/>
+          <w:noProof w:val="0"/>
+          <w:sz w:val="24"/>
+          <w:szCs w:val="24"/>
+          <w:lang w:val="pt-BR"/>
+        </w:rPr>
+      </w:pPr>
+    </w:p>
+    <w:p>
+      <w:pPr>
+        <w:pStyle w:val="Normal"/>
+        <w:suppressLineNumbers w:val="0"/>
+        <w:bidi w:val="0"/>
+        <w:spacing w:before="240" w:beforeAutospacing="off" w:after="240" w:afterAutospacing="off" w:line="279" w:lineRule="auto"/>
+        <w:ind w:left="0" w:right="0"/>
+        <w:jc w:val="left"/>
+      </w:pPr>
+      <w:r>
+        <w:rPr>
+          <w:rFonts w:ascii="Aptos" w:hAnsi="Aptos" w:eastAsia="Aptos" w:cs="Aptos"/>
+          <w:b w:val="1"/>
+          <w:bCs w:val="1"/>
+          <w:noProof w:val="0"/>
+          <w:sz w:val="24"/>
+          <w:szCs w:val="24"/>
+          <w:lang w:val="pt-BR"/>
+        </w:rPr>
+        <w:t>4</w:t>
+      </w:r>
+      <w:r>
+        <w:rPr>
+          <w:rFonts w:ascii="Aptos" w:hAnsi="Aptos" w:eastAsia="Aptos" w:cs="Aptos"/>
+          <w:b w:val="1"/>
+          <w:bCs w:val="1"/>
+          <w:noProof w:val="0"/>
+          <w:sz w:val="24"/>
+          <w:szCs w:val="24"/>
+          <w:lang w:val="pt-BR"/>
+        </w:rPr>
+        <w:t>. Título da página</w:t>
+      </w:r>
+      <w:r>
+        <w:rPr>
+          <w:rFonts w:ascii="Aptos" w:hAnsi="Aptos" w:eastAsia="Aptos" w:cs="Aptos"/>
+          <w:b w:val="1"/>
+          <w:bCs w:val="1"/>
+          <w:noProof w:val="0"/>
+          <w:sz w:val="24"/>
+          <w:szCs w:val="24"/>
+          <w:lang w:val="pt-BR"/>
+        </w:rPr>
+        <w:t xml:space="preserve"> 2 da lição 1</w:t>
+      </w:r>
+    </w:p>
+    <w:p>
+      <w:pPr>
+        <w:pStyle w:val="Normal"/>
+        <w:suppressLineNumbers w:val="0"/>
+        <w:bidi w:val="0"/>
+        <w:spacing w:before="240" w:beforeAutospacing="off" w:after="240" w:afterAutospacing="off" w:line="279" w:lineRule="auto"/>
+        <w:ind w:left="0" w:right="0"/>
+        <w:jc w:val="left"/>
+      </w:pPr>
+      <w:r>
+        <w:rPr>
+          <w:rFonts w:ascii="Aptos" w:hAnsi="Aptos" w:eastAsia="Aptos" w:cs="Aptos"/>
+          <w:noProof w:val="0"/>
+          <w:sz w:val="24"/>
+          <w:szCs w:val="24"/>
+          <w:lang w:val="pt-BR"/>
+        </w:rPr>
+        <w:t xml:space="preserve">Substituir o título </w:t>
+      </w:r>
+      <w:r>
+        <w:rPr>
+          <w:rFonts w:ascii="Aptos" w:hAnsi="Aptos" w:eastAsia="Aptos" w:cs="Aptos"/>
+          <w:b w:val="1"/>
+          <w:bCs w:val="1"/>
+          <w:noProof w:val="0"/>
+          <w:sz w:val="24"/>
+          <w:szCs w:val="24"/>
+          <w:lang w:val="pt-BR"/>
+        </w:rPr>
+        <w:t>“Impactos e Estresse Tóxico”</w:t>
+      </w:r>
+      <w:r>
+        <w:rPr>
+          <w:rFonts w:ascii="Aptos" w:hAnsi="Aptos" w:eastAsia="Aptos" w:cs="Aptos"/>
+          <w:noProof w:val="0"/>
+          <w:sz w:val="24"/>
+          <w:szCs w:val="24"/>
+          <w:lang w:val="pt-BR"/>
+        </w:rPr>
+        <w:t xml:space="preserve"> por:</w:t>
+      </w:r>
+      <w:r>
+        <w:rPr>
+          <w:rFonts w:ascii="Aptos" w:hAnsi="Aptos" w:eastAsia="Aptos" w:cs="Aptos"/>
+          <w:noProof w:val="0"/>
+          <w:sz w:val="24"/>
+          <w:szCs w:val="24"/>
+          <w:lang w:val="pt-BR"/>
+        </w:rPr>
+        <w:t xml:space="preserve"> </w:t>
+      </w:r>
+      <w:r>
+        <w:rPr>
+          <w:rFonts w:ascii="Aptos" w:hAnsi="Aptos" w:eastAsia="Aptos" w:cs="Aptos"/>
+          <w:b w:val="1"/>
+          <w:bCs w:val="1"/>
+          <w:noProof w:val="0"/>
+          <w:sz w:val="24"/>
+          <w:szCs w:val="24"/>
+          <w:lang w:val="pt-BR"/>
+        </w:rPr>
+        <w:t>Impactos da desigualdade no desenvolvimento infantil</w:t>
+      </w:r>
+    </w:p>
+    <w:p>
+      <w:pPr>
+        <w:pStyle w:val="Normal"/>
+        <w:suppressLineNumbers w:val="0"/>
+        <w:bidi w:val="0"/>
+        <w:spacing w:before="240" w:beforeAutospacing="off" w:after="240" w:afterAutospacing="off" w:line="279" w:lineRule="auto"/>
+        <w:ind w:left="0" w:right="0"/>
+        <w:jc w:val="left"/>
+        <w:rPr>
+          <w:rFonts w:ascii="Aptos" w:hAnsi="Aptos" w:eastAsia="Aptos" w:cs="Aptos"/>
+          <w:b w:val="1"/>
+          <w:bCs w:val="1"/>
+          <w:noProof w:val="0"/>
+          <w:sz w:val="24"/>
+          <w:szCs w:val="24"/>
+          <w:lang w:val="pt-BR"/>
+        </w:rPr>
+      </w:pPr>
+    </w:p>
+    <w:p>
+      <w:pPr>
+        <w:pStyle w:val="Normal"/>
+        <w:suppressLineNumbers w:val="0"/>
+        <w:bidi w:val="0"/>
+        <w:spacing w:before="240" w:beforeAutospacing="off" w:after="240" w:afterAutospacing="off" w:line="279" w:lineRule="auto"/>
+        <w:ind w:left="0" w:right="0"/>
+        <w:jc w:val="left"/>
+      </w:pPr>
+      <w:r>
+        <w:rPr>
+          <w:rFonts w:ascii="Aptos" w:hAnsi="Aptos" w:eastAsia="Aptos" w:cs="Aptos"/>
+          <w:b w:val="1"/>
+          <w:bCs w:val="1"/>
+          <w:noProof w:val="0"/>
+          <w:sz w:val="24"/>
+          <w:szCs w:val="24"/>
+          <w:lang w:val="pt-BR"/>
+        </w:rPr>
+        <w:t>5</w:t>
+      </w:r>
+      <w:r>
+        <w:rPr>
+          <w:rFonts w:ascii="Aptos" w:hAnsi="Aptos" w:eastAsia="Aptos" w:cs="Aptos"/>
+          <w:b w:val="1"/>
+          <w:bCs w:val="1"/>
+          <w:noProof w:val="0"/>
+          <w:sz w:val="24"/>
+          <w:szCs w:val="24"/>
+          <w:lang w:val="pt-BR"/>
+        </w:rPr>
+        <w:t>. Box sobre estresse tóxico</w:t>
+      </w:r>
+    </w:p>
+    <w:p>
+      <w:pPr>
+        <w:pStyle w:val="Normal"/>
+        <w:suppressLineNumbers w:val="0"/>
+        <w:bidi w:val="0"/>
+        <w:spacing w:before="240" w:beforeAutospacing="off" w:after="240" w:afterAutospacing="off" w:line="279" w:lineRule="auto"/>
+        <w:ind w:left="0" w:right="0"/>
+        <w:jc w:val="left"/>
+      </w:pPr>
+      <w:r>
+        <w:rPr>
+          <w:rFonts w:ascii="Aptos" w:hAnsi="Aptos" w:eastAsia="Aptos" w:cs="Aptos"/>
+          <w:noProof w:val="0"/>
+          <w:sz w:val="24"/>
+          <w:szCs w:val="24"/>
+          <w:lang w:val="pt-BR"/>
+        </w:rPr>
+        <w:t xml:space="preserve">Mover o box de texto para o </w:t>
+      </w:r>
+      <w:r>
+        <w:rPr>
+          <w:rFonts w:ascii="Aptos" w:hAnsi="Aptos" w:eastAsia="Aptos" w:cs="Aptos"/>
+          <w:b w:val="1"/>
+          <w:bCs w:val="1"/>
+          <w:noProof w:val="0"/>
+          <w:sz w:val="24"/>
+          <w:szCs w:val="24"/>
+          <w:lang w:val="pt-BR"/>
+        </w:rPr>
+        <w:t>final da página</w:t>
+      </w:r>
+      <w:r>
+        <w:rPr>
+          <w:rFonts w:ascii="Aptos" w:hAnsi="Aptos" w:eastAsia="Aptos" w:cs="Aptos"/>
+          <w:noProof w:val="0"/>
+          <w:sz w:val="24"/>
+          <w:szCs w:val="24"/>
+          <w:lang w:val="pt-BR"/>
+        </w:rPr>
+        <w:t>, de modo que seja o último elemento apresentado.</w:t>
+      </w:r>
+    </w:p>
+    <w:p>
+      <w:pPr>
+        <w:bidi w:val="0"/>
+        <w:spacing w:before="240" w:beforeAutospacing="off" w:after="240" w:afterAutospacing="off"/>
+      </w:pPr>
+      <w:r>
+        <w:rPr>
+          <w:rFonts w:ascii="Aptos" w:hAnsi="Aptos" w:eastAsia="Aptos" w:cs="Aptos"/>
+          <w:noProof w:val="0"/>
+          <w:sz w:val="24"/>
+          <w:szCs w:val="24"/>
+          <w:lang w:val="pt-BR"/>
+        </w:rPr>
+        <w:t xml:space="preserve">Substituir o título </w:t>
+      </w:r>
+      <w:r>
+        <w:rPr>
+          <w:rFonts w:ascii="Aptos" w:hAnsi="Aptos" w:eastAsia="Aptos" w:cs="Aptos"/>
+          <w:b w:val="1"/>
+          <w:bCs w:val="1"/>
+          <w:noProof w:val="0"/>
+          <w:sz w:val="24"/>
+          <w:szCs w:val="24"/>
+          <w:lang w:val="pt-BR"/>
+        </w:rPr>
+        <w:t>“Estresse Tóxico”</w:t>
+      </w:r>
+      <w:r>
+        <w:rPr>
+          <w:rFonts w:ascii="Aptos" w:hAnsi="Aptos" w:eastAsia="Aptos" w:cs="Aptos"/>
+          <w:noProof w:val="0"/>
+          <w:sz w:val="24"/>
+          <w:szCs w:val="24"/>
+          <w:lang w:val="pt-BR"/>
+        </w:rPr>
+        <w:t xml:space="preserve"> por:</w:t>
+      </w:r>
+    </w:p>
+    <w:p>
+      <w:pPr>
+        <w:bidi w:val="0"/>
+        <w:spacing w:before="240" w:beforeAutospacing="off" w:after="240" w:afterAutospacing="off"/>
+      </w:pPr>
+      <w:r>
+        <w:rPr>
+          <w:rFonts w:ascii="Aptos" w:hAnsi="Aptos" w:eastAsia="Aptos" w:cs="Aptos"/>
+          <w:b w:val="1"/>
+          <w:bCs w:val="1"/>
+          <w:noProof w:val="0"/>
+          <w:sz w:val="24"/>
+          <w:szCs w:val="24"/>
+          <w:lang w:val="pt-BR"/>
+        </w:rPr>
+        <w:t>Saiba mais sobre estresse tóxico</w:t>
+      </w:r>
+    </w:p>
+    <w:p>
+      <w:pPr>
+        <w:bidi w:val="0"/>
+        <w:spacing w:before="240" w:beforeAutospacing="off" w:after="240" w:afterAutospacing="off"/>
+      </w:pPr>
+      <w:r>
+        <w:rPr>
+          <w:rFonts w:ascii="Aptos" w:hAnsi="Aptos" w:eastAsia="Aptos" w:cs="Aptos"/>
+          <w:noProof w:val="0"/>
+          <w:sz w:val="24"/>
+          <w:szCs w:val="24"/>
+          <w:lang w:val="pt-BR"/>
+        </w:rPr>
+        <w:t xml:space="preserve">Retirar o </w:t>
+      </w:r>
+      <w:r>
+        <w:rPr>
+          <w:rFonts w:ascii="Aptos" w:hAnsi="Aptos" w:eastAsia="Aptos" w:cs="Aptos"/>
+          <w:b w:val="1"/>
+          <w:bCs w:val="1"/>
+          <w:noProof w:val="0"/>
+          <w:sz w:val="24"/>
+          <w:szCs w:val="24"/>
+          <w:lang w:val="pt-BR"/>
+        </w:rPr>
+        <w:t>ícone de exclamação</w:t>
+      </w:r>
+      <w:r>
+        <w:rPr>
+          <w:rFonts w:ascii="Aptos" w:hAnsi="Aptos" w:eastAsia="Aptos" w:cs="Aptos"/>
+          <w:noProof w:val="0"/>
+          <w:sz w:val="24"/>
+          <w:szCs w:val="24"/>
+          <w:lang w:val="pt-BR"/>
+        </w:rPr>
+        <w:t xml:space="preserve"> do título do box de texto.</w:t>
+      </w:r>
+    </w:p>
+    <w:p>
+      <w:pPr>
+        <w:pStyle w:val="Normal"/>
+        <w:suppressLineNumbers w:val="0"/>
+        <w:bidi w:val="0"/>
+        <w:spacing w:before="240" w:beforeAutospacing="off" w:after="240" w:afterAutospacing="off" w:line="279" w:lineRule="auto"/>
+        <w:ind w:left="0" w:right="0"/>
+        <w:jc w:val="left"/>
+        <w:rPr>
+          <w:rFonts w:ascii="Aptos" w:hAnsi="Aptos" w:eastAsia="Aptos" w:cs="Aptos"/>
+          <w:b w:val="1"/>
+          <w:bCs w:val="1"/>
+          <w:noProof w:val="0"/>
+          <w:sz w:val="24"/>
+          <w:szCs w:val="24"/>
+          <w:lang w:val="pt-BR"/>
+        </w:rPr>
+      </w:pPr>
+    </w:p>
+    <w:p>
+      <w:pPr>
+        <w:pStyle w:val="Normal"/>
+        <w:suppressLineNumbers w:val="0"/>
+        <w:bidi w:val="0"/>
+        <w:spacing w:before="240" w:beforeAutospacing="off" w:after="240" w:afterAutospacing="off" w:line="279" w:lineRule="auto"/>
+        <w:ind w:left="0" w:right="0"/>
+        <w:jc w:val="left"/>
+      </w:pPr>
+      <w:r>
+        <w:rPr>
+          <w:rFonts w:ascii="Aptos" w:hAnsi="Aptos" w:eastAsia="Aptos" w:cs="Aptos"/>
+          <w:b w:val="1"/>
+          <w:bCs w:val="1"/>
+          <w:noProof w:val="0"/>
+          <w:sz w:val="24"/>
+          <w:szCs w:val="24"/>
+          <w:lang w:val="pt-BR"/>
+        </w:rPr>
+        <w:t>6</w:t>
+      </w:r>
+      <w:r>
+        <w:rPr>
+          <w:rFonts w:ascii="Aptos" w:hAnsi="Aptos" w:eastAsia="Aptos" w:cs="Aptos"/>
+          <w:b w:val="1"/>
+          <w:bCs w:val="1"/>
+          <w:noProof w:val="0"/>
+          <w:sz w:val="24"/>
+          <w:szCs w:val="24"/>
+          <w:lang w:val="pt-BR"/>
+        </w:rPr>
+        <w:t>. Ajuste n</w:t>
+      </w:r>
+      <w:r>
+        <w:rPr>
+          <w:rFonts w:ascii="Aptos" w:hAnsi="Aptos" w:eastAsia="Aptos" w:cs="Aptos"/>
+          <w:b w:val="1"/>
+          <w:bCs w:val="1"/>
+          <w:noProof w:val="0"/>
+          <w:sz w:val="24"/>
+          <w:szCs w:val="24"/>
+          <w:lang w:val="pt-BR"/>
+        </w:rPr>
+        <w:t>os três parágrafos da página 2, lição 1</w:t>
+      </w:r>
+    </w:p>
+    <w:p>
+      <w:pPr>
+        <w:pStyle w:val="Normal"/>
+        <w:bidi w:val="0"/>
+        <w:spacing w:before="240" w:beforeAutospacing="off" w:after="240" w:afterAutospacing="off"/>
+      </w:pPr>
+      <w:r>
+        <w:rPr>
+          <w:rFonts w:ascii="Aptos" w:hAnsi="Aptos" w:eastAsia="Aptos" w:cs="Aptos"/>
+          <w:noProof w:val="0"/>
+          <w:sz w:val="24"/>
+          <w:szCs w:val="24"/>
+          <w:lang w:val="pt-BR"/>
+        </w:rPr>
+        <w:t xml:space="preserve">Os três parágrafos do conteúdo da </w:t>
+      </w:r>
+      <w:r>
+        <w:rPr>
+          <w:rFonts w:ascii="Aptos" w:hAnsi="Aptos" w:eastAsia="Aptos" w:cs="Aptos"/>
+          <w:b w:val="1"/>
+          <w:bCs w:val="1"/>
+          <w:noProof w:val="0"/>
+          <w:sz w:val="24"/>
+          <w:szCs w:val="24"/>
+          <w:lang w:val="pt-BR"/>
+        </w:rPr>
+        <w:t>página 2</w:t>
+      </w:r>
+      <w:r>
+        <w:rPr>
+          <w:rFonts w:ascii="Aptos" w:hAnsi="Aptos" w:eastAsia="Aptos" w:cs="Aptos"/>
+          <w:noProof w:val="0"/>
+          <w:sz w:val="24"/>
+          <w:szCs w:val="24"/>
+          <w:lang w:val="pt-BR"/>
+        </w:rPr>
+        <w:t xml:space="preserve"> foram revisados. Substituir o texto atualmente publicado na plataforma pela versão revisada apresentada abaixo, mantendo a mesma estrutura e formatação da página:</w:t>
+      </w:r>
+    </w:p>
+    <w:p>
+      <w:pPr>
+        <w:bidi w:val="0"/>
+        <w:spacing w:before="240" w:beforeAutospacing="off" w:after="240" w:afterAutospacing="off"/>
+        <w:rPr>
+          <w:rFonts w:ascii="Aptos" w:hAnsi="Aptos" w:eastAsia="Aptos" w:cs="Aptos"/>
+          <w:noProof w:val="0"/>
+          <w:sz w:val="24"/>
+          <w:szCs w:val="24"/>
+          <w:highlight w:val="yellow"/>
+          <w:lang w:val="pt-BR"/>
+        </w:rPr>
+      </w:pPr>
+      <w:r>
+        <w:rPr>
+          <w:rFonts w:ascii="Aptos" w:hAnsi="Aptos" w:eastAsia="Aptos" w:cs="Aptos"/>
+          <w:noProof w:val="0"/>
+          <w:sz w:val="24"/>
+          <w:szCs w:val="24"/>
+          <w:highlight w:val="yellow"/>
+          <w:lang w:val="pt-BR"/>
+        </w:rPr>
+        <w:t>TEXTO abaixo</w:t>
+      </w:r>
+    </w:p>
+    <w:p>
+      <w:pPr>
+        <w:bidi w:val="0"/>
+        <w:spacing w:before="240" w:beforeAutospacing="off" w:after="240" w:afterAutospacing="off"/>
+      </w:pPr>
+      <w:r>
+        <w:rPr>
+          <w:rFonts w:ascii="Aptos" w:hAnsi="Aptos" w:eastAsia="Aptos" w:cs="Aptos"/>
+          <w:noProof w:val="0"/>
+          <w:sz w:val="24"/>
+          <w:szCs w:val="24"/>
+          <w:lang w:val="pt-BR"/>
+        </w:rPr>
+        <w:t>Na Primeira Infância, o impacto da desigualdade pode ser ainda mais profundo, já que, como vimos, os primeiros anos de vida são fundamentais para o desenvolvimento físico, emocional, social e cognitivo. A falta de acesso à alimentação adequada, por exemplo, compromete o amadurecimento do cérebro e do corpo.</w:t>
+      </w:r>
+    </w:p>
+    <w:p>
+      <w:pPr>
+        <w:bidi w:val="0"/>
+        <w:spacing w:before="240" w:beforeAutospacing="off" w:after="240" w:afterAutospacing="off"/>
+      </w:pPr>
+      <w:r>
+        <w:rPr>
+          <w:rFonts w:ascii="Aptos" w:hAnsi="Aptos" w:eastAsia="Aptos" w:cs="Aptos"/>
+          <w:b w:val="0"/>
+          <w:bCs w:val="0"/>
+          <w:noProof w:val="0"/>
+          <w:sz w:val="24"/>
+          <w:szCs w:val="24"/>
+          <w:lang w:val="pt-BR"/>
+        </w:rPr>
+        <w:t>Além das condições materiais que afetam o desenvolvimento,</w:t>
+      </w:r>
+      <w:r>
+        <w:rPr>
+          <w:rFonts w:ascii="Aptos" w:hAnsi="Aptos" w:eastAsia="Aptos" w:cs="Aptos"/>
+          <w:noProof w:val="0"/>
+          <w:sz w:val="24"/>
+          <w:szCs w:val="24"/>
+          <w:lang w:val="pt-BR"/>
+        </w:rPr>
+        <w:t xml:space="preserve"> muitas crianças convivem com situações contínuas de violência, insegurança e instabilidade familiar. Quando essas situações acontecem de forma intensa e prolongada, sem o apoio adequado de adultos de referência, podem gerar o chamado </w:t>
+      </w:r>
+      <w:r>
+        <w:rPr>
+          <w:rFonts w:ascii="Aptos" w:hAnsi="Aptos" w:eastAsia="Aptos" w:cs="Aptos"/>
+          <w:b w:val="1"/>
+          <w:bCs w:val="1"/>
+          <w:noProof w:val="0"/>
+          <w:sz w:val="24"/>
+          <w:szCs w:val="24"/>
+          <w:lang w:val="pt-BR"/>
+        </w:rPr>
+        <w:t>estresse tóxico</w:t>
+      </w:r>
+      <w:r>
+        <w:rPr>
+          <w:rFonts w:ascii="Aptos" w:hAnsi="Aptos" w:eastAsia="Aptos" w:cs="Aptos"/>
+          <w:noProof w:val="0"/>
+          <w:sz w:val="24"/>
+          <w:szCs w:val="24"/>
+          <w:lang w:val="pt-BR"/>
+        </w:rPr>
+        <w:t>, afetando a memória, a concentração, a aprendizagem e a regulação emocional.</w:t>
+      </w:r>
+    </w:p>
+    <w:p>
+      <w:pPr>
+        <w:bidi w:val="0"/>
+        <w:spacing w:before="240" w:beforeAutospacing="off" w:after="240" w:afterAutospacing="off"/>
+      </w:pPr>
+      <w:r>
+        <w:rPr>
+          <w:rFonts w:ascii="Aptos" w:hAnsi="Aptos" w:eastAsia="Aptos" w:cs="Aptos"/>
+          <w:noProof w:val="0"/>
+          <w:sz w:val="24"/>
+          <w:szCs w:val="24"/>
+          <w:lang w:val="pt-BR"/>
+        </w:rPr>
+        <w:t>No campo da educação, as desigualdades também aparecem no acesso à creche e à educação infantil, especialmente entre famílias de baixa renda. Enquanto algumas crianças frequentam espaços ricos em interações, brincadeiras e estímulos, outras permanecem em contextos de isolamento social ou cuidado precário, o que amplia</w:t>
+      </w:r>
+      <w:r>
+        <w:rPr>
+          <w:rFonts w:ascii="Aptos" w:hAnsi="Aptos" w:eastAsia="Aptos" w:cs="Aptos"/>
+          <w:b w:val="1"/>
+          <w:bCs w:val="1"/>
+          <w:noProof w:val="0"/>
+          <w:sz w:val="24"/>
+          <w:szCs w:val="24"/>
+          <w:lang w:val="pt-BR"/>
+        </w:rPr>
+        <w:t xml:space="preserve"> </w:t>
+      </w:r>
+      <w:r>
+        <w:rPr>
+          <w:rFonts w:ascii="Aptos" w:hAnsi="Aptos" w:eastAsia="Aptos" w:cs="Aptos"/>
+          <w:b w:val="0"/>
+          <w:bCs w:val="0"/>
+          <w:noProof w:val="0"/>
+          <w:sz w:val="24"/>
+          <w:szCs w:val="24"/>
+          <w:lang w:val="pt-BR"/>
+        </w:rPr>
+        <w:t>as diferenças nas oportunidades de aprendizagem e convivência</w:t>
+      </w:r>
+      <w:r>
+        <w:rPr>
+          <w:rFonts w:ascii="Aptos" w:hAnsi="Aptos" w:eastAsia="Aptos" w:cs="Aptos"/>
+          <w:b w:val="0"/>
+          <w:bCs w:val="0"/>
+          <w:noProof w:val="0"/>
+          <w:sz w:val="24"/>
+          <w:szCs w:val="24"/>
+          <w:lang w:val="pt-BR"/>
+        </w:rPr>
+        <w:t>.</w:t>
+      </w:r>
+    </w:p>
+    <w:p>
+      <w:pPr>
+        <w:bidi w:val="0"/>
+        <w:spacing w:before="240" w:beforeAutospacing="off" w:after="240" w:afterAutospacing="off"/>
+        <w:rPr>
+          <w:rFonts w:ascii="Aptos" w:hAnsi="Aptos" w:eastAsia="Aptos" w:cs="Aptos"/>
+          <w:b w:val="1"/>
+          <w:bCs w:val="1"/>
+          <w:noProof w:val="0"/>
+          <w:sz w:val="24"/>
+          <w:szCs w:val="24"/>
+          <w:lang w:val="pt-BR"/>
+        </w:rPr>
+      </w:pPr>
+    </w:p>
+    <w:p>
+      <w:pPr>
+        <w:bidi w:val="0"/>
+        <w:spacing w:before="240" w:beforeAutospacing="off" w:after="240" w:afterAutospacing="off"/>
+      </w:pPr>
+      <w:r>
+        <w:rPr>
+          <w:rFonts w:ascii="Aptos" w:hAnsi="Aptos" w:eastAsia="Aptos" w:cs="Aptos"/>
+          <w:b w:val="1"/>
+          <w:bCs w:val="1"/>
+          <w:noProof w:val="0"/>
+          <w:sz w:val="24"/>
+          <w:szCs w:val="24"/>
+          <w:lang w:val="pt-BR"/>
+        </w:rPr>
+        <w:t>7. Página 3 – O papel das redes de proteção</w:t>
+      </w:r>
+    </w:p>
+    <w:p>
+      <w:pPr>
+        <w:bidi w:val="0"/>
+        <w:spacing w:before="240" w:beforeAutospacing="off" w:after="240" w:afterAutospacing="off"/>
+        <w:rPr>
+          <w:rFonts w:ascii="Aptos" w:hAnsi="Aptos" w:eastAsia="Aptos" w:cs="Aptos"/>
+          <w:noProof w:val="0"/>
+          <w:sz w:val="24"/>
+          <w:szCs w:val="24"/>
+          <w:highlight w:val="yellow"/>
+          <w:lang w:val="pt-BR"/>
+        </w:rPr>
+      </w:pPr>
+      <w:r>
+        <w:rPr>
+          <w:rFonts w:ascii="Aptos" w:hAnsi="Aptos" w:eastAsia="Aptos" w:cs="Aptos"/>
+          <w:noProof w:val="0"/>
+          <w:sz w:val="24"/>
+          <w:szCs w:val="24"/>
+          <w:highlight w:val="yellow"/>
+          <w:lang w:val="pt-BR"/>
+        </w:rPr>
+        <w:t>Substituir integralmente o conteúdo atual da página pelo conteúdo apresentado abaixo, mantendo a mesma estrutura e o padrão visual já adotado na plataforma.</w:t>
+      </w:r>
+    </w:p>
+    <w:p>
+      <w:pPr>
+        <w:bidi w:val="0"/>
+        <w:spacing w:before="240" w:beforeAutospacing="off" w:after="240" w:afterAutospacing="off"/>
+      </w:pPr>
+      <w:r>
+        <w:rPr>
+          <w:rFonts w:ascii="Aptos" w:hAnsi="Aptos" w:eastAsia="Aptos" w:cs="Aptos"/>
+          <w:b w:val="1"/>
+          <w:bCs w:val="1"/>
+          <w:noProof w:val="0"/>
+          <w:sz w:val="24"/>
+          <w:szCs w:val="24"/>
+          <w:lang w:val="pt-BR"/>
+        </w:rPr>
+        <w:t>[Título da página]</w:t>
+      </w:r>
+      <w:r>
+        <w:rPr>
+          <w:rFonts w:ascii="Aptos" w:hAnsi="Aptos" w:eastAsia="Aptos" w:cs="Aptos"/>
+          <w:b w:val="0"/>
+          <w:bCs w:val="0"/>
+          <w:noProof w:val="0"/>
+          <w:sz w:val="24"/>
+          <w:szCs w:val="24"/>
+          <w:lang w:val="pt-BR"/>
+        </w:rPr>
+        <w:t xml:space="preserve"> </w:t>
+      </w:r>
+      <w:r>
+        <w:rPr>
+          <w:rFonts w:ascii="Aptos" w:hAnsi="Aptos" w:eastAsia="Aptos" w:cs="Aptos"/>
+          <w:b w:val="1"/>
+          <w:bCs w:val="1"/>
+          <w:noProof w:val="0"/>
+          <w:sz w:val="24"/>
+          <w:szCs w:val="24"/>
+          <w:lang w:val="pt-BR"/>
+        </w:rPr>
+        <w:t xml:space="preserve">O papel das redes de </w:t>
+      </w:r>
+      <w:r>
+        <w:rPr>
+          <w:rFonts w:ascii="Aptos" w:hAnsi="Aptos" w:eastAsia="Aptos" w:cs="Aptos"/>
+          <w:b w:val="1"/>
+          <w:bCs w:val="1"/>
+          <w:noProof w:val="0"/>
+          <w:sz w:val="24"/>
+          <w:szCs w:val="24"/>
+          <w:lang w:val="pt-BR"/>
+        </w:rPr>
+        <w:t xml:space="preserve">cuidado e </w:t>
+      </w:r>
+      <w:r>
+        <w:rPr>
+          <w:rFonts w:ascii="Aptos" w:hAnsi="Aptos" w:eastAsia="Aptos" w:cs="Aptos"/>
+          <w:b w:val="1"/>
+          <w:bCs w:val="1"/>
+          <w:noProof w:val="0"/>
+          <w:sz w:val="24"/>
+          <w:szCs w:val="24"/>
+          <w:lang w:val="pt-BR"/>
+        </w:rPr>
+        <w:t>proteção na promoção da equidade</w:t>
+      </w:r>
+    </w:p>
+    <w:p>
+      <w:pPr>
+        <w:bidi w:val="0"/>
+        <w:spacing w:before="240" w:beforeAutospacing="off" w:after="240" w:afterAutospacing="off"/>
+      </w:pPr>
+      <w:r>
+        <w:rPr>
+          <w:rFonts w:ascii="Aptos" w:hAnsi="Aptos" w:eastAsia="Aptos" w:cs="Aptos"/>
+          <w:noProof w:val="0"/>
+          <w:sz w:val="24"/>
+          <w:szCs w:val="24"/>
+          <w:lang w:val="pt-BR"/>
+        </w:rPr>
+        <w:t xml:space="preserve">Diante das desigualdades que atravessam a vida de muitas crianças, as </w:t>
+      </w:r>
+      <w:r>
+        <w:rPr>
+          <w:rFonts w:ascii="Aptos" w:hAnsi="Aptos" w:eastAsia="Aptos" w:cs="Aptos"/>
+          <w:b w:val="1"/>
+          <w:bCs w:val="1"/>
+          <w:noProof w:val="0"/>
+          <w:sz w:val="24"/>
+          <w:szCs w:val="24"/>
+          <w:lang w:val="pt-BR"/>
+        </w:rPr>
+        <w:t>redes de cuidado e proteção</w:t>
+      </w:r>
+      <w:r>
+        <w:rPr>
+          <w:rFonts w:ascii="Aptos" w:hAnsi="Aptos" w:eastAsia="Aptos" w:cs="Aptos"/>
+          <w:noProof w:val="0"/>
+          <w:sz w:val="24"/>
+          <w:szCs w:val="24"/>
+          <w:lang w:val="pt-BR"/>
+        </w:rPr>
+        <w:t xml:space="preserve"> têm um papel fundamental. Famílias, pessoas educadoras, profissionais da saúde, bibliotecas, organizações comunitárias e políticas públicas fazem parte dessas redes e, quando atuam de forma articulada, podem contribuir para garantir direitos, identificar situações de vulnerabilidade e construir contextos mais acolhedores e protetivos para as crianças.</w:t>
+      </w:r>
+    </w:p>
+    <w:p>
+      <w:pPr>
+        <w:pStyle w:val="Normal"/>
+        <w:suppressLineNumbers w:val="0"/>
+        <w:bidi w:val="0"/>
+        <w:spacing w:before="240" w:beforeAutospacing="off" w:after="240" w:afterAutospacing="off" w:line="279" w:lineRule="auto"/>
+        <w:ind w:left="0" w:right="0"/>
+        <w:jc w:val="left"/>
+        <w:rPr>
+          <w:rFonts w:ascii="Aptos" w:hAnsi="Aptos" w:eastAsia="Aptos" w:cs="Aptos"/>
+          <w:noProof w:val="0"/>
+          <w:sz w:val="24"/>
+          <w:szCs w:val="24"/>
+          <w:lang w:val="pt-BR"/>
+        </w:rPr>
+      </w:pPr>
+      <w:r>
+        <w:rPr>
+          <w:rFonts w:ascii="Aptos" w:hAnsi="Aptos" w:eastAsia="Aptos" w:cs="Aptos"/>
+          <w:noProof w:val="0"/>
+          <w:sz w:val="24"/>
+          <w:szCs w:val="24"/>
+          <w:lang w:val="pt-BR"/>
+        </w:rPr>
+        <w:t xml:space="preserve">Fortalecer essas redes também é uma forma de enfrentar as desigualdades, ampliando as possibilidades de acesso ao cuidado, à saúde, à educação, à cultura e a outros direitos fundamentais. </w:t>
+      </w:r>
+      <w:r>
+        <w:rPr>
+          <w:rFonts w:ascii="Aptos" w:hAnsi="Aptos" w:eastAsia="Aptos" w:cs="Aptos"/>
+          <w:b w:val="0"/>
+          <w:bCs w:val="0"/>
+          <w:noProof w:val="0"/>
+          <w:sz w:val="24"/>
+          <w:szCs w:val="24"/>
+          <w:lang w:val="pt-BR"/>
+        </w:rPr>
+        <w:t xml:space="preserve">Para isso, é preciso conhecer as diferentes condições em que vivem as crianças brasileiras e considerar essas realidades na construção de práticas de cuidado e proteção mais inclusivas e comprometidas com a </w:t>
+      </w:r>
+      <w:r>
+        <w:rPr>
+          <w:rFonts w:ascii="Aptos" w:hAnsi="Aptos" w:eastAsia="Aptos" w:cs="Aptos"/>
+          <w:b w:val="1"/>
+          <w:bCs w:val="1"/>
+          <w:noProof w:val="0"/>
+          <w:sz w:val="24"/>
+          <w:szCs w:val="24"/>
+          <w:lang w:val="pt-BR"/>
+        </w:rPr>
+        <w:t>equidade</w:t>
+      </w:r>
+      <w:r>
+        <w:rPr>
+          <w:rFonts w:ascii="Aptos" w:hAnsi="Aptos" w:eastAsia="Aptos" w:cs="Aptos"/>
+          <w:b w:val="0"/>
+          <w:bCs w:val="0"/>
+          <w:noProof w:val="0"/>
+          <w:sz w:val="24"/>
+          <w:szCs w:val="24"/>
+          <w:lang w:val="pt-BR"/>
+        </w:rPr>
+        <w:t>.</w:t>
+      </w:r>
+    </w:p>
+    <w:p>
+      <w:pPr>
+        <w:bidi w:val="0"/>
+        <w:spacing w:before="240" w:beforeAutospacing="off" w:after="240" w:afterAutospacing="off"/>
+        <w:rPr>
+          <w:rFonts w:ascii="Aptos" w:hAnsi="Aptos" w:eastAsia="Aptos" w:cs="Aptos"/>
+          <w:b w:val="1"/>
+          <w:bCs w:val="1"/>
+          <w:noProof w:val="0"/>
+          <w:sz w:val="24"/>
+          <w:szCs w:val="24"/>
+          <w:lang w:val="pt-BR"/>
+        </w:rPr>
+      </w:pPr>
+    </w:p>
+    <w:p>
+      <w:pPr>
+        <w:bidi w:val="0"/>
+        <w:spacing w:before="240" w:beforeAutospacing="off" w:after="240" w:afterAutospacing="off"/>
+      </w:pPr>
+      <w:r>
+        <w:rPr>
+          <w:rFonts w:ascii="Aptos" w:hAnsi="Aptos" w:eastAsia="Aptos" w:cs="Aptos"/>
+          <w:b w:val="1"/>
+          <w:bCs w:val="1"/>
+          <w:noProof w:val="0"/>
+          <w:sz w:val="24"/>
+          <w:szCs w:val="24"/>
+          <w:lang w:val="pt-BR"/>
+        </w:rPr>
+        <w:t>BOX DE TEXTO</w:t>
+      </w:r>
+    </w:p>
+    <w:p>
+      <w:pPr>
+        <w:bidi w:val="0"/>
+        <w:spacing w:before="240" w:beforeAutospacing="off" w:after="240" w:afterAutospacing="off"/>
+      </w:pPr>
+      <w:r>
+        <w:rPr>
+          <w:rFonts w:ascii="Aptos" w:hAnsi="Aptos" w:eastAsia="Aptos" w:cs="Aptos"/>
+          <w:b w:val="1"/>
+          <w:bCs w:val="1"/>
+          <w:noProof w:val="0"/>
+          <w:sz w:val="24"/>
+          <w:szCs w:val="24"/>
+          <w:lang w:val="pt-BR"/>
+        </w:rPr>
+        <w:t>Você sabe o que é equidade?</w:t>
+      </w:r>
+    </w:p>
+    <w:p>
+      <w:pPr>
+        <w:bidi w:val="0"/>
+        <w:spacing w:before="240" w:beforeAutospacing="off" w:after="240" w:afterAutospacing="off"/>
+      </w:pPr>
+      <w:r>
+        <w:rPr>
+          <w:rFonts w:ascii="Aptos" w:hAnsi="Aptos" w:eastAsia="Aptos" w:cs="Aptos"/>
+          <w:noProof w:val="0"/>
+          <w:sz w:val="24"/>
+          <w:szCs w:val="24"/>
+          <w:lang w:val="pt-BR"/>
+        </w:rPr>
+        <w:t>Equidade significa reconhecer que as pessoas vivem em condições diferentes e, por isso, podem precisar de apoios e oportunidades diferentes para que seus direitos sejam garantidos.</w:t>
+      </w:r>
+    </w:p>
+    <w:p>
+      <w:pPr>
+        <w:pStyle w:val="Normal"/>
+        <w:suppressLineNumbers w:val="0"/>
+        <w:bidi w:val="0"/>
+        <w:spacing w:before="240" w:beforeAutospacing="off" w:after="240" w:afterAutospacing="off" w:line="279" w:lineRule="auto"/>
+        <w:ind w:left="0" w:right="0"/>
+        <w:jc w:val="left"/>
+      </w:pPr>
+      <w:r>
+        <w:rPr>
+          <w:rFonts w:ascii="Aptos" w:hAnsi="Aptos" w:eastAsia="Aptos" w:cs="Aptos"/>
+          <w:b w:val="1"/>
+          <w:bCs w:val="1"/>
+          <w:noProof w:val="0"/>
+          <w:sz w:val="24"/>
+          <w:szCs w:val="24"/>
+          <w:lang w:val="pt-BR"/>
+        </w:rPr>
+        <w:t>8. Página 5 – “Infâncias no Território: Olhar e Refletir”</w:t>
+      </w:r>
+    </w:p>
+    <w:p>
+      <w:pPr>
+        <w:bidi w:val="0"/>
+        <w:spacing w:before="240" w:beforeAutospacing="off" w:after="240" w:afterAutospacing="off"/>
+      </w:pPr>
+      <w:r>
+        <w:rPr>
+          <w:rFonts w:ascii="Aptos" w:hAnsi="Aptos" w:eastAsia="Aptos" w:cs="Aptos"/>
+          <w:noProof w:val="0"/>
+          <w:sz w:val="24"/>
+          <w:szCs w:val="24"/>
+          <w:lang w:val="pt-BR"/>
+        </w:rPr>
+        <w:t xml:space="preserve">Excluir esta página. O conteúdo será posteriormente transformado em um </w:t>
+      </w:r>
+      <w:r>
+        <w:rPr>
+          <w:rFonts w:ascii="Aptos" w:hAnsi="Aptos" w:eastAsia="Aptos" w:cs="Aptos"/>
+          <w:b w:val="1"/>
+          <w:bCs w:val="1"/>
+          <w:noProof w:val="0"/>
+          <w:sz w:val="24"/>
+          <w:szCs w:val="24"/>
+          <w:lang w:val="pt-BR"/>
+        </w:rPr>
+        <w:t>fórum</w:t>
+      </w:r>
+      <w:r>
+        <w:rPr>
+          <w:rFonts w:ascii="Aptos" w:hAnsi="Aptos" w:eastAsia="Aptos" w:cs="Aptos"/>
+          <w:noProof w:val="0"/>
+          <w:sz w:val="24"/>
+          <w:szCs w:val="24"/>
+          <w:lang w:val="pt-BR"/>
+        </w:rPr>
+        <w:t>, cujas orientações serão encaminhadas separadamente.</w:t>
+      </w:r>
+    </w:p>
+    <w:p>
+      <w:pPr>
+        <w:pStyle w:val="Normal"/>
+        <w:suppressLineNumbers w:val="0"/>
+        <w:bidi w:val="0"/>
+        <w:spacing w:before="240" w:beforeAutospacing="off" w:after="240" w:afterAutospacing="off" w:line="279" w:lineRule="auto"/>
+        <w:ind w:left="0" w:right="0"/>
+        <w:jc w:val="left"/>
+      </w:pPr>
+      <w:r>
+        <w:rPr>
+          <w:rFonts w:ascii="Aptos" w:hAnsi="Aptos" w:eastAsia="Aptos" w:cs="Aptos"/>
+          <w:b w:val="1"/>
+          <w:bCs w:val="1"/>
+          <w:noProof w:val="0"/>
+          <w:sz w:val="24"/>
+          <w:szCs w:val="24"/>
+          <w:lang w:val="pt-BR"/>
+        </w:rPr>
+        <w:t>9. Página “Síntese: Desafios e Potências no Território”</w:t>
+      </w:r>
+    </w:p>
+    <w:p>
+      <w:pPr>
+        <w:bidi w:val="0"/>
+        <w:spacing w:before="240" w:beforeAutospacing="off" w:after="240" w:afterAutospacing="off"/>
+      </w:pPr>
+      <w:r>
+        <w:rPr>
+          <w:rFonts w:ascii="Aptos" w:hAnsi="Aptos" w:eastAsia="Aptos" w:cs="Aptos"/>
+          <w:noProof w:val="0"/>
+          <w:sz w:val="24"/>
+          <w:szCs w:val="24"/>
+          <w:lang w:val="pt-BR"/>
+        </w:rPr>
+        <w:t>Excluir integralmente esta página. Esse conteúdo não será mantido na lição.</w:t>
+      </w:r>
+    </w:p>
+    <w:p>
+      <w:pPr>
+        <w:pStyle w:val="Normal"/>
+        <w:suppressLineNumbers w:val="0"/>
+        <w:bidi w:val="0"/>
+        <w:spacing w:before="240" w:beforeAutospacing="off" w:after="240" w:afterAutospacing="off" w:line="279" w:lineRule="auto"/>
+        <w:ind w:left="0" w:right="0"/>
+        <w:jc w:val="left"/>
+      </w:pPr>
+      <w:r>
+        <w:rPr>
+          <w:rFonts w:ascii="Aptos" w:hAnsi="Aptos" w:eastAsia="Aptos" w:cs="Aptos"/>
+          <w:b w:val="1"/>
+          <w:bCs w:val="1"/>
+          <w:noProof w:val="0"/>
+          <w:sz w:val="24"/>
+          <w:szCs w:val="24"/>
+          <w:lang w:val="pt-BR"/>
+        </w:rPr>
+        <w:t>10. Desafio de Palavras – “Contextos e Realidades”</w:t>
+      </w:r>
+    </w:p>
+    <w:p>
+      <w:pPr>
+        <w:bidi w:val="0"/>
+        <w:spacing w:before="240" w:beforeAutospacing="off" w:after="240" w:afterAutospacing="off"/>
+      </w:pPr>
+      <w:r>
+        <w:rPr>
+          <w:rFonts w:ascii="Aptos" w:hAnsi="Aptos" w:eastAsia="Aptos" w:cs="Aptos"/>
+          <w:noProof w:val="0"/>
+          <w:sz w:val="24"/>
+          <w:szCs w:val="24"/>
+          <w:lang w:val="pt-BR"/>
+        </w:rPr>
+        <w:t xml:space="preserve">Na atividade de palavras cruzadas, substituir o conceito atualmente explorado, </w:t>
+      </w:r>
+      <w:r>
+        <w:rPr>
+          <w:rFonts w:ascii="Aptos" w:hAnsi="Aptos" w:eastAsia="Aptos" w:cs="Aptos"/>
+          <w:b w:val="1"/>
+          <w:bCs w:val="1"/>
+          <w:noProof w:val="0"/>
+          <w:sz w:val="24"/>
+          <w:szCs w:val="24"/>
+          <w:lang w:val="pt-BR"/>
+        </w:rPr>
+        <w:t>“equidade”</w:t>
+      </w:r>
+      <w:r>
+        <w:rPr>
+          <w:rFonts w:ascii="Aptos" w:hAnsi="Aptos" w:eastAsia="Aptos" w:cs="Aptos"/>
+          <w:noProof w:val="0"/>
+          <w:sz w:val="24"/>
+          <w:szCs w:val="24"/>
+          <w:lang w:val="pt-BR"/>
+        </w:rPr>
+        <w:t>, pela formulação apresentada abaixo:</w:t>
+      </w:r>
+    </w:p>
+    <w:p>
+      <w:pPr>
+        <w:bidi w:val="0"/>
+        <w:spacing w:before="240" w:beforeAutospacing="off" w:after="240" w:afterAutospacing="off"/>
+      </w:pPr>
+      <w:r>
+        <w:rPr>
+          <w:rFonts w:ascii="Aptos" w:hAnsi="Aptos" w:eastAsia="Aptos" w:cs="Aptos"/>
+          <w:b w:val="1"/>
+          <w:bCs w:val="1"/>
+          <w:noProof w:val="0"/>
+          <w:sz w:val="24"/>
+          <w:szCs w:val="24"/>
+          <w:lang w:val="pt-BR"/>
+        </w:rPr>
+        <w:t>Nova formulação:</w:t>
+      </w:r>
+    </w:p>
+    <w:p>
+      <w:pPr>
+        <w:pStyle w:val="Normal"/>
+        <w:bidi w:val="0"/>
+        <w:spacing w:before="240" w:beforeAutospacing="off" w:after="240" w:afterAutospacing="off"/>
+      </w:pPr>
+      <w:r>
+        <w:rPr>
+          <w:rFonts w:ascii="Aptos" w:hAnsi="Aptos" w:eastAsia="Aptos" w:cs="Aptos"/>
+          <w:noProof w:val="0"/>
+          <w:sz w:val="24"/>
+          <w:szCs w:val="24"/>
+          <w:lang w:val="pt-BR"/>
+        </w:rPr>
+        <w:t>Princípio que reconhece que as pessoas vivem em condições diferentes e podem precisar de apoios e oportunidades diferentes para que seus direitos sejam garantidos.</w:t>
+      </w:r>
+    </w:p>
+    <w:p>
+      <w:pPr>
+        <w:pStyle w:val="Normal"/>
+        <w:bidi w:val="0"/>
+        <w:spacing w:before="240" w:beforeAutospacing="off" w:after="240" w:afterAutospacing="off"/>
+        <w:rPr>
+          <w:rFonts w:ascii="Aptos" w:hAnsi="Aptos" w:eastAsia="Aptos" w:cs="Aptos"/>
+          <w:noProof w:val="0"/>
+          <w:sz w:val="24"/>
+          <w:szCs w:val="24"/>
+          <w:lang w:val="pt-BR"/>
+        </w:rPr>
+      </w:pPr>
+    </w:p>
+    <w:p>
+      <w:pPr>
+        <w:pStyle w:val="Normal"/>
+        <w:suppressLineNumbers w:val="0"/>
+        <w:bidi w:val="0"/>
+        <w:spacing w:before="0" w:beforeAutospacing="off" w:after="160" w:afterAutospacing="off" w:line="279" w:lineRule="auto"/>
+        <w:ind w:left="0" w:right="0"/>
+        <w:jc w:val="left"/>
+      </w:pPr>
+      <w:r>
+        <w:rPr>
+          <w:noProof w:val="0"/>
+          <w:sz w:val="28"/>
+          <w:szCs w:val="28"/>
+          <w:lang w:val="pt-BR"/>
+        </w:rPr>
+        <w:t xml:space="preserve">Lição 2: Conhecer para </w:t>
+      </w:r>
+      <w:r>
+        <w:rPr>
+          <w:noProof w:val="0"/>
+          <w:sz w:val="28"/>
+          <w:szCs w:val="28"/>
+          <w:highlight w:val="yellow"/>
+          <w:lang w:val="pt-BR"/>
+        </w:rPr>
+        <w:t>T</w:t>
+      </w:r>
+      <w:r>
+        <w:rPr>
+          <w:noProof w:val="0"/>
+          <w:sz w:val="28"/>
+          <w:szCs w:val="28"/>
+          <w:lang w:val="pt-BR"/>
+        </w:rPr>
+        <w:t>ransformar</w:t>
+      </w:r>
+    </w:p>
+    <w:p>
+      <w:pPr>
+        <w:bidi w:val="0"/>
+        <w:spacing w:before="240" w:beforeAutospacing="off" w:after="240" w:afterAutospacing="off"/>
+      </w:pPr>
+      <w:r>
+        <w:rPr>
+          <w:rFonts w:ascii="Aptos" w:hAnsi="Aptos" w:eastAsia="Aptos" w:cs="Aptos"/>
+          <w:b w:val="1"/>
+          <w:bCs w:val="1"/>
+          <w:noProof w:val="0"/>
+          <w:sz w:val="24"/>
+          <w:szCs w:val="24"/>
+          <w:lang w:val="pt-BR"/>
+        </w:rPr>
+        <w:t>1. Título do card da Lição 2</w:t>
+      </w:r>
+    </w:p>
+    <w:p>
+      <w:pPr>
+        <w:bidi w:val="0"/>
+        <w:spacing w:before="240" w:beforeAutospacing="off" w:after="240" w:afterAutospacing="off"/>
+      </w:pPr>
+      <w:r>
+        <w:rPr>
+          <w:rFonts w:ascii="Aptos" w:hAnsi="Aptos" w:eastAsia="Aptos" w:cs="Aptos"/>
+          <w:noProof w:val="0"/>
+          <w:sz w:val="24"/>
+          <w:szCs w:val="24"/>
+          <w:lang w:val="pt-BR"/>
+        </w:rPr>
+        <w:t xml:space="preserve">No título </w:t>
+      </w:r>
+      <w:r>
+        <w:rPr>
+          <w:rFonts w:ascii="Aptos" w:hAnsi="Aptos" w:eastAsia="Aptos" w:cs="Aptos"/>
+          <w:b w:val="1"/>
+          <w:bCs w:val="1"/>
+          <w:noProof w:val="0"/>
+          <w:sz w:val="24"/>
+          <w:szCs w:val="24"/>
+          <w:lang w:val="pt-BR"/>
+        </w:rPr>
+        <w:t>“Conhecer para Transformar”</w:t>
+      </w:r>
+      <w:r>
+        <w:rPr>
+          <w:rFonts w:ascii="Aptos" w:hAnsi="Aptos" w:eastAsia="Aptos" w:cs="Aptos"/>
+          <w:noProof w:val="0"/>
+          <w:sz w:val="24"/>
+          <w:szCs w:val="24"/>
+          <w:lang w:val="pt-BR"/>
+        </w:rPr>
+        <w:t xml:space="preserve">, alterar a inicial da palavra </w:t>
+      </w:r>
+      <w:r>
+        <w:rPr>
+          <w:rFonts w:ascii="Aptos" w:hAnsi="Aptos" w:eastAsia="Aptos" w:cs="Aptos"/>
+          <w:b w:val="1"/>
+          <w:bCs w:val="1"/>
+          <w:noProof w:val="0"/>
+          <w:sz w:val="24"/>
+          <w:szCs w:val="24"/>
+          <w:lang w:val="pt-BR"/>
+        </w:rPr>
+        <w:t>“Transformar”</w:t>
+      </w:r>
+      <w:r>
+        <w:rPr>
+          <w:rFonts w:ascii="Aptos" w:hAnsi="Aptos" w:eastAsia="Aptos" w:cs="Aptos"/>
+          <w:noProof w:val="0"/>
+          <w:sz w:val="24"/>
+          <w:szCs w:val="24"/>
+          <w:lang w:val="pt-BR"/>
+        </w:rPr>
+        <w:t xml:space="preserve"> para letra maiúscula, mantendo o título como: </w:t>
+      </w:r>
+      <w:r>
+        <w:rPr>
+          <w:rFonts w:ascii="Aptos" w:hAnsi="Aptos" w:eastAsia="Aptos" w:cs="Aptos"/>
+          <w:b w:val="1"/>
+          <w:bCs w:val="1"/>
+          <w:noProof w:val="0"/>
+          <w:sz w:val="24"/>
+          <w:szCs w:val="24"/>
+          <w:lang w:val="pt-BR"/>
+        </w:rPr>
+        <w:t xml:space="preserve">Conhecer </w:t>
+      </w:r>
+      <w:r>
+        <w:rPr>
+          <w:rFonts w:ascii="Aptos" w:hAnsi="Aptos" w:eastAsia="Aptos" w:cs="Aptos"/>
+          <w:b w:val="1"/>
+          <w:bCs w:val="1"/>
+          <w:noProof w:val="0"/>
+          <w:sz w:val="24"/>
+          <w:szCs w:val="24"/>
+          <w:lang w:val="pt-BR"/>
+        </w:rPr>
+        <w:t>para Transformar</w:t>
+      </w:r>
+    </w:p>
+    <w:p>
+      <w:pPr>
+        <w:bidi w:val="0"/>
+        <w:spacing w:before="240" w:beforeAutospacing="off" w:after="240" w:afterAutospacing="off"/>
+        <w:rPr>
+          <w:rFonts w:ascii="Aptos" w:hAnsi="Aptos" w:eastAsia="Aptos" w:cs="Aptos"/>
+          <w:b w:val="1"/>
+          <w:bCs w:val="1"/>
+          <w:noProof w:val="0"/>
+          <w:sz w:val="24"/>
+          <w:szCs w:val="24"/>
+          <w:lang w:val="pt-BR"/>
+        </w:rPr>
+      </w:pPr>
+    </w:p>
+    <w:p>
+      <w:pPr>
+        <w:bidi w:val="0"/>
+        <w:spacing w:before="240" w:beforeAutospacing="off" w:after="240" w:afterAutospacing="off"/>
+      </w:pPr>
+      <w:r>
+        <w:rPr>
+          <w:rFonts w:ascii="Aptos" w:hAnsi="Aptos" w:eastAsia="Aptos" w:cs="Aptos"/>
+          <w:b w:val="1"/>
+          <w:bCs w:val="1"/>
+          <w:noProof w:val="0"/>
+          <w:sz w:val="24"/>
+          <w:szCs w:val="24"/>
+          <w:lang w:val="pt-BR"/>
+        </w:rPr>
+        <w:t>2. Ajuste no título da página 1, lição 2</w:t>
+      </w:r>
+    </w:p>
+    <w:p>
+      <w:pPr>
+        <w:bidi w:val="0"/>
+        <w:spacing w:before="240" w:beforeAutospacing="off" w:after="240" w:afterAutospacing="off"/>
+      </w:pPr>
+      <w:r>
+        <w:rPr>
+          <w:rFonts w:ascii="Aptos" w:hAnsi="Aptos" w:eastAsia="Aptos" w:cs="Aptos"/>
+          <w:noProof w:val="0"/>
+          <w:sz w:val="24"/>
+          <w:szCs w:val="24"/>
+          <w:lang w:val="pt-BR"/>
+        </w:rPr>
+        <w:t xml:space="preserve">Manter o título, alterando apenas o uso de maiúsculas e minúsculas para: </w:t>
+      </w:r>
+      <w:r>
+        <w:rPr>
+          <w:rFonts w:ascii="Aptos" w:hAnsi="Aptos" w:eastAsia="Aptos" w:cs="Aptos"/>
+          <w:b w:val="1"/>
+          <w:bCs w:val="1"/>
+          <w:noProof w:val="0"/>
+          <w:sz w:val="24"/>
+          <w:szCs w:val="24"/>
+          <w:lang w:val="pt-BR"/>
+        </w:rPr>
+        <w:t>O papel dos dados e indicadores</w:t>
+      </w:r>
+    </w:p>
+    <w:p>
+      <w:pPr>
+        <w:bidi w:val="0"/>
+        <w:spacing w:before="240" w:beforeAutospacing="off" w:after="240" w:afterAutospacing="off"/>
+        <w:rPr>
+          <w:rFonts w:ascii="Aptos" w:hAnsi="Aptos" w:eastAsia="Aptos" w:cs="Aptos"/>
+          <w:b w:val="1"/>
+          <w:bCs w:val="1"/>
+          <w:noProof w:val="0"/>
+          <w:sz w:val="24"/>
+          <w:szCs w:val="24"/>
+          <w:lang w:val="pt-BR"/>
+        </w:rPr>
+      </w:pPr>
+    </w:p>
+    <w:p>
+      <w:pPr>
+        <w:pStyle w:val="Normal"/>
+        <w:bidi w:val="0"/>
+        <w:spacing w:before="240" w:beforeAutospacing="off" w:after="240" w:afterAutospacing="off"/>
+      </w:pPr>
+      <w:r>
+        <w:rPr>
+          <w:rFonts w:ascii="Aptos" w:hAnsi="Aptos" w:eastAsia="Aptos" w:cs="Aptos"/>
+          <w:noProof w:val="0"/>
+          <w:sz w:val="24"/>
+          <w:szCs w:val="24"/>
+          <w:lang w:val="pt-BR"/>
+        </w:rPr>
+        <w:t xml:space="preserve">2. No primeiro parágrafo da </w:t>
+      </w:r>
+      <w:r>
+        <w:rPr>
+          <w:rFonts w:ascii="Aptos" w:hAnsi="Aptos" w:eastAsia="Aptos" w:cs="Aptos"/>
+          <w:b w:val="1"/>
+          <w:bCs w:val="1"/>
+          <w:noProof w:val="0"/>
+          <w:sz w:val="24"/>
+          <w:szCs w:val="24"/>
+          <w:lang w:val="pt-BR"/>
+        </w:rPr>
+        <w:t>página 1 da Lição 2</w:t>
+      </w:r>
+      <w:r>
+        <w:rPr>
+          <w:rFonts w:ascii="Aptos" w:hAnsi="Aptos" w:eastAsia="Aptos" w:cs="Aptos"/>
+          <w:noProof w:val="0"/>
+          <w:sz w:val="24"/>
+          <w:szCs w:val="24"/>
+          <w:lang w:val="pt-BR"/>
+        </w:rPr>
+        <w:t xml:space="preserve">, alterar a expressão </w:t>
+      </w:r>
+      <w:r>
+        <w:rPr>
+          <w:rFonts w:ascii="Aptos" w:hAnsi="Aptos" w:eastAsia="Aptos" w:cs="Aptos"/>
+          <w:b w:val="1"/>
+          <w:bCs w:val="1"/>
+          <w:noProof w:val="0"/>
+          <w:sz w:val="24"/>
+          <w:szCs w:val="24"/>
+          <w:lang w:val="pt-BR"/>
+        </w:rPr>
+        <w:t>“primeira infância”</w:t>
+      </w:r>
+      <w:r>
+        <w:rPr>
+          <w:rFonts w:ascii="Aptos" w:hAnsi="Aptos" w:eastAsia="Aptos" w:cs="Aptos"/>
+          <w:noProof w:val="0"/>
+          <w:sz w:val="24"/>
+          <w:szCs w:val="24"/>
+          <w:lang w:val="pt-BR"/>
+        </w:rPr>
+        <w:t xml:space="preserve"> para </w:t>
+      </w:r>
+      <w:r>
+        <w:rPr>
+          <w:rFonts w:ascii="Aptos" w:hAnsi="Aptos" w:eastAsia="Aptos" w:cs="Aptos"/>
+          <w:b w:val="1"/>
+          <w:bCs w:val="1"/>
+          <w:noProof w:val="0"/>
+          <w:sz w:val="24"/>
+          <w:szCs w:val="24"/>
+          <w:lang w:val="pt-BR"/>
+        </w:rPr>
+        <w:t>“Primeira Infância”</w:t>
+      </w:r>
+      <w:r>
+        <w:rPr>
+          <w:rFonts w:ascii="Aptos" w:hAnsi="Aptos" w:eastAsia="Aptos" w:cs="Aptos"/>
+          <w:noProof w:val="0"/>
+          <w:sz w:val="24"/>
+          <w:szCs w:val="24"/>
+          <w:lang w:val="pt-BR"/>
+        </w:rPr>
+        <w:t>, com as iniciais em letras maiúsculas.</w:t>
+      </w:r>
+    </w:p>
+    <w:p>
+      <w:pPr>
+        <w:pStyle w:val="Normal"/>
+        <w:bidi w:val="0"/>
+        <w:spacing w:before="240" w:beforeAutospacing="off" w:after="240" w:afterAutospacing="off"/>
+        <w:rPr>
+          <w:rFonts w:ascii="Aptos" w:hAnsi="Aptos" w:eastAsia="Aptos" w:cs="Aptos"/>
+          <w:noProof w:val="0"/>
+          <w:sz w:val="24"/>
+          <w:szCs w:val="24"/>
+          <w:lang w:val="pt-BR"/>
+        </w:rPr>
+      </w:pPr>
+    </w:p>
+    <w:p>
+      <w:pPr>
+        <w:bidi w:val="0"/>
+        <w:spacing w:before="240" w:beforeAutospacing="off" w:after="240" w:afterAutospacing="off"/>
+      </w:pPr>
+      <w:r>
+        <w:rPr>
+          <w:rFonts w:ascii="Aptos" w:hAnsi="Aptos" w:eastAsia="Aptos" w:cs="Aptos"/>
+          <w:b w:val="1"/>
+          <w:bCs w:val="1"/>
+          <w:noProof w:val="0"/>
+          <w:sz w:val="24"/>
+          <w:szCs w:val="24"/>
+          <w:lang w:val="pt-BR"/>
+        </w:rPr>
+        <w:t>3. Reorganização do conteúdo</w:t>
+      </w:r>
+    </w:p>
+    <w:p>
+      <w:pPr>
+        <w:bidi w:val="0"/>
+        <w:spacing w:before="240" w:beforeAutospacing="off" w:after="240" w:afterAutospacing="off"/>
+      </w:pPr>
+      <w:r>
+        <w:rPr>
+          <w:rFonts w:ascii="Aptos" w:hAnsi="Aptos" w:eastAsia="Aptos" w:cs="Aptos"/>
+          <w:noProof w:val="0"/>
+          <w:sz w:val="24"/>
+          <w:szCs w:val="24"/>
+          <w:lang w:val="pt-BR"/>
+        </w:rPr>
+        <w:t xml:space="preserve">Trazer o conteúdo atualmente apresentado na </w:t>
+      </w:r>
+      <w:r>
+        <w:rPr>
+          <w:rFonts w:ascii="Aptos" w:hAnsi="Aptos" w:eastAsia="Aptos" w:cs="Aptos"/>
+          <w:b w:val="1"/>
+          <w:bCs w:val="1"/>
+          <w:noProof w:val="0"/>
+          <w:sz w:val="24"/>
+          <w:szCs w:val="24"/>
+          <w:lang w:val="pt-BR"/>
+        </w:rPr>
+        <w:t xml:space="preserve">página 2 da Lição </w:t>
+      </w:r>
+      <w:r>
+        <w:rPr>
+          <w:rFonts w:ascii="Aptos" w:hAnsi="Aptos" w:eastAsia="Aptos" w:cs="Aptos"/>
+          <w:b w:val="1"/>
+          <w:bCs w:val="1"/>
+          <w:noProof w:val="0"/>
+          <w:sz w:val="24"/>
+          <w:szCs w:val="24"/>
+          <w:lang w:val="pt-BR"/>
+        </w:rPr>
+        <w:t>2</w:t>
+      </w:r>
+      <w:r>
+        <w:rPr>
+          <w:rFonts w:ascii="Aptos" w:hAnsi="Aptos" w:eastAsia="Aptos" w:cs="Aptos"/>
+          <w:noProof w:val="0"/>
+          <w:sz w:val="24"/>
+          <w:szCs w:val="24"/>
+          <w:lang w:val="pt-BR"/>
+        </w:rPr>
+        <w:t xml:space="preserve">  (</w:t>
+      </w:r>
+      <w:r>
+        <w:rPr>
+          <w:rFonts w:ascii="Aptos" w:hAnsi="Aptos" w:eastAsia="Aptos" w:cs="Aptos"/>
+          <w:noProof w:val="0"/>
+          <w:sz w:val="24"/>
+          <w:szCs w:val="24"/>
+          <w:lang w:val="pt-BR"/>
+        </w:rPr>
+        <w:t xml:space="preserve">James Heckman e o investimento da infância) para a </w:t>
+      </w:r>
+      <w:r>
+        <w:rPr>
+          <w:rFonts w:ascii="Aptos" w:hAnsi="Aptos" w:eastAsia="Aptos" w:cs="Aptos"/>
+          <w:b w:val="1"/>
+          <w:bCs w:val="1"/>
+          <w:noProof w:val="0"/>
+          <w:sz w:val="24"/>
+          <w:szCs w:val="24"/>
+          <w:lang w:val="pt-BR"/>
+        </w:rPr>
+        <w:t>página 1</w:t>
+      </w:r>
+      <w:r>
+        <w:rPr>
+          <w:rFonts w:ascii="Aptos" w:hAnsi="Aptos" w:eastAsia="Aptos" w:cs="Aptos"/>
+          <w:b w:val="1"/>
+          <w:bCs w:val="1"/>
+          <w:noProof w:val="0"/>
+          <w:sz w:val="24"/>
+          <w:szCs w:val="24"/>
+          <w:lang w:val="pt-BR"/>
+        </w:rPr>
+        <w:t xml:space="preserve"> - O papel dos dados e indicadores </w:t>
+      </w:r>
+      <w:r>
+        <w:rPr>
+          <w:rFonts w:ascii="Aptos" w:hAnsi="Aptos" w:eastAsia="Aptos" w:cs="Aptos"/>
+          <w:noProof w:val="0"/>
+          <w:sz w:val="24"/>
+          <w:szCs w:val="24"/>
+          <w:lang w:val="pt-BR"/>
+        </w:rPr>
+        <w:t>.</w:t>
+      </w:r>
+    </w:p>
+    <w:p>
+      <w:pPr>
+        <w:bidi w:val="0"/>
+        <w:spacing w:before="240" w:beforeAutospacing="off" w:after="240" w:afterAutospacing="off"/>
+      </w:pPr>
+      <w:r>
+        <w:rPr>
+          <w:rFonts w:ascii="Aptos" w:hAnsi="Aptos" w:eastAsia="Aptos" w:cs="Aptos"/>
+          <w:noProof w:val="0"/>
+          <w:sz w:val="24"/>
+          <w:szCs w:val="24"/>
+          <w:lang w:val="pt-BR"/>
+        </w:rPr>
+        <w:t xml:space="preserve">Assim, a página 1 deverá reunir </w:t>
+      </w:r>
+      <w:r>
+        <w:rPr>
+          <w:rFonts w:ascii="Aptos" w:hAnsi="Aptos" w:eastAsia="Aptos" w:cs="Aptos"/>
+          <w:b w:val="1"/>
+          <w:bCs w:val="1"/>
+          <w:noProof w:val="0"/>
+          <w:sz w:val="24"/>
+          <w:szCs w:val="24"/>
+          <w:lang w:val="pt-BR"/>
+        </w:rPr>
+        <w:t>o conteúdo que já está nela e, na sequência, o conteúdo atualmente apresentado na página 2</w:t>
+      </w:r>
+      <w:r>
+        <w:rPr>
+          <w:rFonts w:ascii="Aptos" w:hAnsi="Aptos" w:eastAsia="Aptos" w:cs="Aptos"/>
+          <w:noProof w:val="0"/>
+          <w:sz w:val="24"/>
+          <w:szCs w:val="24"/>
+          <w:lang w:val="pt-BR"/>
+        </w:rPr>
+        <w:t>.</w:t>
+      </w:r>
+    </w:p>
+    <w:p>
+      <w:pPr>
+        <w:bidi w:val="0"/>
+        <w:spacing w:before="240" w:beforeAutospacing="off" w:after="240" w:afterAutospacing="off"/>
+        <w:rPr>
+          <w:rFonts w:ascii="Aptos" w:hAnsi="Aptos" w:eastAsia="Aptos" w:cs="Aptos"/>
+          <w:noProof w:val="0"/>
+          <w:sz w:val="24"/>
+          <w:szCs w:val="24"/>
+          <w:lang w:val="pt-BR"/>
+        </w:rPr>
+      </w:pPr>
+    </w:p>
+    <w:p>
+      <w:pPr>
+        <w:bidi w:val="0"/>
+        <w:spacing w:before="240" w:beforeAutospacing="off" w:after="240" w:afterAutospacing="off"/>
+      </w:pPr>
+      <w:r>
+        <w:rPr>
+          <w:rFonts w:ascii="Aptos" w:hAnsi="Aptos" w:eastAsia="Aptos" w:cs="Aptos"/>
+          <w:b w:val="1"/>
+          <w:bCs w:val="1"/>
+          <w:noProof w:val="0"/>
+          <w:sz w:val="24"/>
+          <w:szCs w:val="24"/>
+          <w:lang w:val="pt-BR"/>
+        </w:rPr>
+        <w:t>4. Alteração do título</w:t>
+      </w:r>
+    </w:p>
+    <w:p>
+      <w:pPr>
+        <w:bidi w:val="0"/>
+        <w:spacing w:before="240" w:beforeAutospacing="off" w:after="240" w:afterAutospacing="off"/>
+      </w:pPr>
+      <w:r>
+        <w:rPr>
+          <w:rFonts w:ascii="Aptos" w:hAnsi="Aptos" w:eastAsia="Aptos" w:cs="Aptos"/>
+          <w:noProof w:val="0"/>
+          <w:sz w:val="24"/>
+          <w:szCs w:val="24"/>
+          <w:lang w:val="pt-BR"/>
+        </w:rPr>
+        <w:t xml:space="preserve">Substituir o título </w:t>
+      </w:r>
+      <w:r>
+        <w:rPr>
+          <w:rFonts w:ascii="Aptos" w:hAnsi="Aptos" w:eastAsia="Aptos" w:cs="Aptos"/>
+          <w:b w:val="1"/>
+          <w:bCs w:val="1"/>
+          <w:noProof w:val="0"/>
+          <w:sz w:val="24"/>
+          <w:szCs w:val="24"/>
+          <w:lang w:val="pt-BR"/>
+        </w:rPr>
+        <w:t>“Conhecendo a plataforma Primeira Infância em Dados”</w:t>
+      </w:r>
+      <w:r>
+        <w:rPr>
+          <w:rFonts w:ascii="Aptos" w:hAnsi="Aptos" w:eastAsia="Aptos" w:cs="Aptos"/>
+          <w:noProof w:val="0"/>
+          <w:sz w:val="24"/>
+          <w:szCs w:val="24"/>
+          <w:lang w:val="pt-BR"/>
+        </w:rPr>
+        <w:t xml:space="preserve"> por:</w:t>
+      </w:r>
+    </w:p>
+    <w:p>
+      <w:pPr>
+        <w:bidi w:val="0"/>
+        <w:spacing w:before="240" w:beforeAutospacing="off" w:after="240" w:afterAutospacing="off"/>
+      </w:pPr>
+      <w:r>
+        <w:rPr>
+          <w:rFonts w:ascii="Aptos" w:hAnsi="Aptos" w:eastAsia="Aptos" w:cs="Aptos"/>
+          <w:b w:val="1"/>
+          <w:bCs w:val="1"/>
+          <w:noProof w:val="0"/>
+          <w:sz w:val="24"/>
+          <w:szCs w:val="24"/>
+          <w:lang w:val="pt-BR"/>
+        </w:rPr>
+        <w:t>De Olho nos Dados</w:t>
+      </w:r>
+    </w:p>
+    <w:p>
+      <w:pPr>
+        <w:bidi w:val="0"/>
+        <w:spacing w:before="240" w:beforeAutospacing="off" w:after="240" w:afterAutospacing="off"/>
+        <w:rPr>
+          <w:rFonts w:ascii="Aptos" w:hAnsi="Aptos" w:eastAsia="Aptos" w:cs="Aptos"/>
+          <w:b w:val="1"/>
+          <w:bCs w:val="1"/>
+          <w:noProof w:val="0"/>
+          <w:sz w:val="24"/>
+          <w:szCs w:val="24"/>
+          <w:lang w:val="pt-BR"/>
+        </w:rPr>
+      </w:pPr>
+    </w:p>
+    <w:p>
+      <w:pPr>
+        <w:bidi w:val="0"/>
+        <w:spacing w:before="240" w:beforeAutospacing="off" w:after="240" w:afterAutospacing="off"/>
+      </w:pPr>
+      <w:r>
+        <w:rPr>
+          <w:rFonts w:ascii="Aptos" w:hAnsi="Aptos" w:eastAsia="Aptos" w:cs="Aptos"/>
+          <w:b w:val="1"/>
+          <w:bCs w:val="1"/>
+          <w:noProof w:val="0"/>
+          <w:sz w:val="24"/>
+          <w:szCs w:val="24"/>
+          <w:lang w:val="pt-BR"/>
+        </w:rPr>
+        <w:t xml:space="preserve">5. </w:t>
+      </w:r>
+      <w:r>
+        <w:rPr>
+          <w:rFonts w:ascii="Aptos" w:hAnsi="Aptos" w:eastAsia="Aptos" w:cs="Aptos"/>
+          <w:noProof w:val="0"/>
+          <w:sz w:val="24"/>
+          <w:szCs w:val="24"/>
+          <w:lang w:val="pt-BR"/>
+        </w:rPr>
+        <w:t xml:space="preserve">No trecho iniciado pela pergunta </w:t>
+      </w:r>
+      <w:r>
+        <w:rPr>
+          <w:rFonts w:ascii="Aptos" w:hAnsi="Aptos" w:eastAsia="Aptos" w:cs="Aptos"/>
+          <w:b w:val="1"/>
+          <w:bCs w:val="1"/>
+          <w:noProof w:val="0"/>
+          <w:sz w:val="24"/>
+          <w:szCs w:val="24"/>
+          <w:lang w:val="pt-BR"/>
+        </w:rPr>
+        <w:t>“Você conhece a plataforma Primeira Infância em Dados?”</w:t>
+      </w:r>
+      <w:r>
+        <w:rPr>
+          <w:rFonts w:ascii="Aptos" w:hAnsi="Aptos" w:eastAsia="Aptos" w:cs="Aptos"/>
+          <w:noProof w:val="0"/>
+          <w:sz w:val="24"/>
+          <w:szCs w:val="24"/>
+          <w:lang w:val="pt-BR"/>
+        </w:rPr>
+        <w:t xml:space="preserve">, ajustar o parágrafo seguinte para evitar a repetição do nome da plataforma, substituindo a retomada por </w:t>
+      </w:r>
+      <w:r>
+        <w:rPr>
+          <w:rFonts w:ascii="Aptos" w:hAnsi="Aptos" w:eastAsia="Aptos" w:cs="Aptos"/>
+          <w:b w:val="1"/>
+          <w:bCs w:val="1"/>
+          <w:noProof w:val="0"/>
+          <w:sz w:val="24"/>
+          <w:szCs w:val="24"/>
+          <w:lang w:val="pt-BR"/>
+        </w:rPr>
+        <w:t>“Esse observatório interativo”</w:t>
+      </w:r>
+      <w:r>
+        <w:rPr>
+          <w:rFonts w:ascii="Aptos" w:hAnsi="Aptos" w:eastAsia="Aptos" w:cs="Aptos"/>
+          <w:noProof w:val="0"/>
+          <w:sz w:val="24"/>
+          <w:szCs w:val="24"/>
+          <w:lang w:val="pt-BR"/>
+        </w:rPr>
+        <w:t>.</w:t>
+      </w:r>
+    </w:p>
+    <w:p>
+      <w:pPr>
+        <w:pStyle w:val="Normal"/>
+        <w:suppressLineNumbers w:val="0"/>
+        <w:bidi w:val="0"/>
+        <w:spacing w:before="240" w:beforeAutospacing="off" w:after="240" w:afterAutospacing="off" w:line="279" w:lineRule="auto"/>
+        <w:ind w:left="0" w:right="0"/>
+        <w:jc w:val="left"/>
+        <w:rPr>
+          <w:rFonts w:ascii="Aptos" w:hAnsi="Aptos" w:eastAsia="Aptos" w:cs="Aptos"/>
+          <w:noProof w:val="0"/>
+          <w:sz w:val="24"/>
+          <w:szCs w:val="24"/>
+          <w:highlight w:val="yellow"/>
+          <w:lang w:val="pt-BR"/>
+        </w:rPr>
+      </w:pPr>
+      <w:r>
+        <w:rPr>
+          <w:rFonts w:ascii="Aptos" w:hAnsi="Aptos" w:eastAsia="Aptos" w:cs="Aptos"/>
+          <w:noProof w:val="0"/>
+          <w:sz w:val="24"/>
+          <w:szCs w:val="24"/>
+          <w:highlight w:val="yellow"/>
+          <w:lang w:val="pt-BR"/>
+        </w:rPr>
+        <w:t>O trecho deverá ficar assim:</w:t>
+      </w:r>
+      <w:r>
+        <w:rPr>
+          <w:rFonts w:ascii="Aptos" w:hAnsi="Aptos" w:eastAsia="Aptos" w:cs="Aptos"/>
+          <w:noProof w:val="0"/>
+          <w:sz w:val="24"/>
+          <w:szCs w:val="24"/>
+          <w:lang w:val="pt-BR"/>
+        </w:rPr>
+        <w:t xml:space="preserve"> </w:t>
+      </w:r>
+    </w:p>
+    <w:p>
+      <w:pPr>
+        <w:pStyle w:val="Normal"/>
+        <w:bidi w:val="0"/>
+        <w:spacing w:before="240" w:beforeAutospacing="off" w:after="240" w:afterAutospacing="off" w:line="279" w:lineRule="auto"/>
+        <w:ind w:left="0" w:right="0"/>
+        <w:jc w:val="left"/>
+        <w:rPr>
+          <w:rFonts w:ascii="Aptos" w:hAnsi="Aptos" w:eastAsia="Aptos" w:cs="Aptos" w:asciiTheme="minorAscii" w:hAnsiTheme="minorAscii" w:eastAsiaTheme="minorAscii" w:cstheme="minorAscii"/>
+          <w:noProof w:val="0"/>
+          <w:sz w:val="24"/>
+          <w:szCs w:val="24"/>
+          <w:lang w:val="pt-BR"/>
+        </w:rPr>
+      </w:pPr>
+      <w:r>
+        <w:rPr>
+          <w:rFonts w:ascii="Aptos" w:hAnsi="Aptos" w:eastAsia="Aptos" w:cs="Aptos" w:asciiTheme="minorAscii" w:hAnsiTheme="minorAscii" w:eastAsiaTheme="minorAscii" w:cstheme="minorAscii"/>
+          <w:b w:val="0"/>
+          <w:bCs w:val="0"/>
+          <w:i w:val="0"/>
+          <w:iCs w:val="0"/>
+          <w:caps w:val="0"/>
+          <w:smallCaps w:val="0"/>
+          <w:noProof w:val="0"/>
+          <w:color w:val="261810"/>
+          <w:sz w:val="24"/>
+          <w:szCs w:val="24"/>
+          <w:lang w:val="pt-BR"/>
+        </w:rPr>
+        <w:t xml:space="preserve">Você conhece a plataforma </w:t>
+      </w:r>
+      <w:r>
+        <w:rPr>
+          <w:rFonts w:ascii="Aptos" w:hAnsi="Aptos" w:eastAsia="Aptos" w:cs="Aptos" w:asciiTheme="minorAscii" w:hAnsiTheme="minorAscii" w:eastAsiaTheme="minorAscii" w:cstheme="minorAscii"/>
+          <w:b w:val="1"/>
+          <w:bCs w:val="1"/>
+          <w:i w:val="0"/>
+          <w:iCs w:val="0"/>
+          <w:caps w:val="0"/>
+          <w:smallCaps w:val="0"/>
+          <w:noProof w:val="0"/>
+          <w:color w:val="auto"/>
+          <w:sz w:val="24"/>
+          <w:szCs w:val="24"/>
+          <w:lang w:val="pt-BR"/>
+        </w:rPr>
+        <w:t>Primeira Infância em Dados</w:t>
+      </w:r>
+      <w:r>
+        <w:rPr>
+          <w:rFonts w:ascii="Aptos" w:hAnsi="Aptos" w:eastAsia="Aptos" w:cs="Aptos" w:asciiTheme="minorAscii" w:hAnsiTheme="minorAscii" w:eastAsiaTheme="minorAscii" w:cstheme="minorAscii"/>
+          <w:b w:val="0"/>
+          <w:bCs w:val="0"/>
+          <w:i w:val="0"/>
+          <w:iCs w:val="0"/>
+          <w:caps w:val="0"/>
+          <w:smallCaps w:val="0"/>
+          <w:noProof w:val="0"/>
+          <w:color w:val="261810"/>
+          <w:sz w:val="24"/>
+          <w:szCs w:val="24"/>
+          <w:lang w:val="pt-BR"/>
+        </w:rPr>
+        <w:t>?</w:t>
+      </w:r>
+    </w:p>
+    <w:p>
+      <w:pPr>
+        <w:pStyle w:val="Normal"/>
+        <w:bidi w:val="0"/>
+        <w:spacing w:before="240" w:beforeAutospacing="off" w:after="240" w:afterAutospacing="off" w:line="279" w:lineRule="auto"/>
+        <w:ind w:left="0" w:right="0"/>
+        <w:jc w:val="left"/>
+        <w:rPr>
+          <w:rFonts w:ascii="Aptos" w:hAnsi="Aptos" w:eastAsia="Aptos" w:cs="Aptos" w:asciiTheme="minorAscii" w:hAnsiTheme="minorAscii" w:eastAsiaTheme="minorAscii" w:cstheme="minorAscii"/>
+          <w:noProof w:val="0"/>
+          <w:sz w:val="24"/>
+          <w:szCs w:val="24"/>
+          <w:lang w:val="pt-BR"/>
+        </w:rPr>
+      </w:pPr>
+      <w:r>
+        <w:rPr>
+          <w:rFonts w:ascii="Aptos" w:hAnsi="Aptos" w:eastAsia="Aptos" w:cs="Aptos" w:asciiTheme="minorAscii" w:hAnsiTheme="minorAscii" w:eastAsiaTheme="minorAscii" w:cstheme="minorAscii"/>
+          <w:b w:val="0"/>
+          <w:bCs w:val="0"/>
+          <w:noProof w:val="0"/>
+          <w:sz w:val="24"/>
+          <w:szCs w:val="24"/>
+          <w:lang w:val="pt-BR"/>
+        </w:rPr>
+        <w:t>Esse observatório interativo</w:t>
+      </w:r>
+      <w:r>
+        <w:rPr>
+          <w:rFonts w:ascii="Aptos" w:hAnsi="Aptos" w:eastAsia="Aptos" w:cs="Aptos" w:asciiTheme="minorAscii" w:hAnsiTheme="minorAscii" w:eastAsiaTheme="minorAscii" w:cstheme="minorAscii"/>
+          <w:b w:val="0"/>
+          <w:bCs w:val="0"/>
+          <w:noProof w:val="0"/>
+          <w:sz w:val="24"/>
+          <w:szCs w:val="24"/>
+          <w:lang w:val="pt-BR"/>
+        </w:rPr>
+        <w:t xml:space="preserve"> </w:t>
+      </w:r>
+      <w:r>
+        <w:rPr>
+          <w:rFonts w:ascii="Aptos" w:hAnsi="Aptos" w:eastAsia="Aptos" w:cs="Aptos" w:asciiTheme="minorAscii" w:hAnsiTheme="minorAscii" w:eastAsiaTheme="minorAscii" w:cstheme="minorAscii"/>
+          <w:noProof w:val="0"/>
+          <w:sz w:val="24"/>
+          <w:szCs w:val="24"/>
+          <w:lang w:val="pt-BR"/>
+        </w:rPr>
+        <w:t>reúne indicadores dos municípios brasileiros e permite refletir sobre como vivem as crianças em cada território, quais desafios enfrentam e quais ações podem ser fortalecidas. Conhecer essa realidade é um passo importante para promover infâncias mais protegidas, acolhedoras e cheias de possibilidades.</w:t>
+      </w:r>
+    </w:p>
+    <w:p>
+      <w:pPr>
+        <w:shd w:val="clear" w:color="auto" w:fill="FFFFFF" w:themeFill="background1"/>
+        <w:bidi w:val="0"/>
+        <w:spacing w:before="0" w:beforeAutospacing="off" w:after="240" w:afterAutospacing="off"/>
+        <w:jc w:val="left"/>
+      </w:pPr>
+      <w:r>
+        <w:rPr>
+          <w:rFonts w:ascii="Aptos" w:hAnsi="Aptos" w:eastAsia="Aptos" w:cs="Aptos" w:asciiTheme="minorAscii" w:hAnsiTheme="minorAscii" w:eastAsiaTheme="minorAscii" w:cstheme="minorAscii"/>
+          <w:b w:val="0"/>
+          <w:bCs w:val="0"/>
+          <w:i w:val="0"/>
+          <w:iCs w:val="0"/>
+          <w:caps w:val="0"/>
+          <w:smallCaps w:val="0"/>
+          <w:noProof w:val="0"/>
+          <w:color w:val="261810"/>
+          <w:sz w:val="24"/>
+          <w:szCs w:val="24"/>
+          <w:lang w:val="pt-BR"/>
+        </w:rPr>
+        <w:t>Que tal descobrir como está o cenário da primeira infância em seu município? Vamos nessa?</w:t>
+      </w:r>
+    </w:p>
+    <w:p>
+      <w:pPr>
+        <w:shd w:val="clear" w:color="auto" w:fill="FFFFFF" w:themeFill="background1"/>
+        <w:bidi w:val="0"/>
+        <w:spacing w:before="0" w:beforeAutospacing="off" w:after="240" w:afterAutospacing="off"/>
+        <w:jc w:val="left"/>
+      </w:pPr>
+      <w:r>
+        <w:rPr>
+          <w:rFonts w:ascii="Aptos" w:hAnsi="Aptos" w:eastAsia="Aptos" w:cs="Aptos" w:asciiTheme="minorAscii" w:hAnsiTheme="minorAscii" w:eastAsiaTheme="minorAscii" w:cstheme="minorAscii"/>
+          <w:b w:val="0"/>
+          <w:bCs w:val="0"/>
+          <w:i w:val="0"/>
+          <w:iCs w:val="0"/>
+          <w:caps w:val="0"/>
+          <w:smallCaps w:val="0"/>
+          <w:noProof w:val="0"/>
+          <w:color w:val="261810"/>
+          <w:sz w:val="24"/>
+          <w:szCs w:val="24"/>
+          <w:lang w:val="pt-BR"/>
+        </w:rPr>
+        <w:t>[manter box de texto com o link para o site]</w:t>
+      </w:r>
+    </w:p>
+    <w:p>
+      <w:pPr>
+        <w:shd w:val="clear" w:color="auto" w:fill="FFFFFF" w:themeFill="background1"/>
+        <w:bidi w:val="0"/>
+        <w:spacing w:before="0" w:beforeAutospacing="off" w:after="240" w:afterAutospacing="off"/>
+        <w:jc w:val="left"/>
+        <w:rPr>
+          <w:rFonts w:ascii="Aptos" w:hAnsi="Aptos" w:eastAsia="Aptos" w:cs="Aptos" w:asciiTheme="minorAscii" w:hAnsiTheme="minorAscii" w:eastAsiaTheme="minorAscii" w:cstheme="minorAscii"/>
+          <w:b w:val="0"/>
+          <w:bCs w:val="0"/>
+          <w:i w:val="0"/>
+          <w:iCs w:val="0"/>
+          <w:caps w:val="0"/>
+          <w:smallCaps w:val="0"/>
+          <w:noProof w:val="0"/>
+          <w:color w:val="261810"/>
+          <w:sz w:val="24"/>
+          <w:szCs w:val="24"/>
+          <w:lang w:val="pt-BR"/>
+        </w:rPr>
+      </w:pPr>
+    </w:p>
+    <w:p>
+      <w:pPr>
+        <w:bidi w:val="0"/>
+        <w:spacing w:before="240" w:beforeAutospacing="off" w:after="240" w:afterAutospacing="off"/>
+        <w:jc w:val="left"/>
+      </w:pPr>
+      <w:r>
+        <w:rPr>
+          <w:rFonts w:ascii="Aptos" w:hAnsi="Aptos" w:eastAsia="Aptos" w:cs="Aptos"/>
+          <w:b w:val="1"/>
+          <w:bCs w:val="1"/>
+          <w:noProof w:val="0"/>
+          <w:sz w:val="24"/>
+          <w:szCs w:val="24"/>
+          <w:lang w:val="pt-BR"/>
+        </w:rPr>
+        <w:t>6. Ajuste na organização do conteúdo</w:t>
+      </w:r>
+    </w:p>
+    <w:p>
+      <w:pPr>
+        <w:bidi w:val="0"/>
+        <w:spacing w:before="240" w:beforeAutospacing="off" w:after="240" w:afterAutospacing="off"/>
+        <w:jc w:val="left"/>
+      </w:pPr>
+      <w:r>
+        <w:rPr>
+          <w:rFonts w:ascii="Aptos" w:hAnsi="Aptos" w:eastAsia="Aptos" w:cs="Aptos"/>
+          <w:noProof w:val="0"/>
+          <w:sz w:val="24"/>
+          <w:szCs w:val="24"/>
+          <w:lang w:val="pt-BR"/>
+        </w:rPr>
+        <w:t xml:space="preserve">Na página </w:t>
+      </w:r>
+      <w:r>
+        <w:rPr>
+          <w:rFonts w:ascii="Aptos" w:hAnsi="Aptos" w:eastAsia="Aptos" w:cs="Aptos"/>
+          <w:b w:val="1"/>
+          <w:bCs w:val="1"/>
+          <w:noProof w:val="0"/>
+          <w:sz w:val="24"/>
+          <w:szCs w:val="24"/>
+          <w:lang w:val="pt-BR"/>
+        </w:rPr>
+        <w:t>“Políticas de Proteção e Cuidado”</w:t>
+      </w:r>
+      <w:r>
+        <w:rPr>
+          <w:rFonts w:ascii="Aptos" w:hAnsi="Aptos" w:eastAsia="Aptos" w:cs="Aptos"/>
+          <w:noProof w:val="0"/>
+          <w:sz w:val="24"/>
+          <w:szCs w:val="24"/>
+          <w:lang w:val="pt-BR"/>
+        </w:rPr>
+        <w:t xml:space="preserve">, retirar do </w:t>
+      </w:r>
+      <w:r>
+        <w:rPr>
+          <w:rFonts w:ascii="Aptos" w:hAnsi="Aptos" w:eastAsia="Aptos" w:cs="Aptos"/>
+          <w:b w:val="1"/>
+          <w:bCs w:val="1"/>
+          <w:noProof w:val="0"/>
+          <w:sz w:val="24"/>
+          <w:szCs w:val="24"/>
+          <w:lang w:val="pt-BR"/>
+        </w:rPr>
+        <w:t>box de texto</w:t>
+      </w:r>
+      <w:r>
+        <w:rPr>
+          <w:rFonts w:ascii="Aptos" w:hAnsi="Aptos" w:eastAsia="Aptos" w:cs="Aptos"/>
+          <w:noProof w:val="0"/>
+          <w:sz w:val="24"/>
+          <w:szCs w:val="24"/>
+          <w:lang w:val="pt-BR"/>
+        </w:rPr>
+        <w:t xml:space="preserve"> o primeiro parágrafo, iniciado por </w:t>
+      </w:r>
+      <w:r>
+        <w:rPr>
+          <w:rFonts w:ascii="Aptos" w:hAnsi="Aptos" w:eastAsia="Aptos" w:cs="Aptos"/>
+          <w:b w:val="1"/>
+          <w:bCs w:val="1"/>
+          <w:noProof w:val="0"/>
+          <w:sz w:val="24"/>
+          <w:szCs w:val="24"/>
+          <w:lang w:val="pt-BR"/>
+        </w:rPr>
+        <w:t>“Conhecer a trajetória das leis e políticas públicas no Brasil ajuda a compreender...”</w:t>
+      </w:r>
+      <w:r>
+        <w:rPr>
+          <w:rFonts w:ascii="Aptos" w:hAnsi="Aptos" w:eastAsia="Aptos" w:cs="Aptos"/>
+          <w:noProof w:val="0"/>
+          <w:sz w:val="24"/>
+          <w:szCs w:val="24"/>
+          <w:lang w:val="pt-BR"/>
+        </w:rPr>
+        <w:t>.</w:t>
+      </w:r>
+    </w:p>
+    <w:p>
+      <w:pPr>
+        <w:bidi w:val="0"/>
+        <w:spacing w:before="240" w:beforeAutospacing="off" w:after="240" w:afterAutospacing="off"/>
+        <w:jc w:val="left"/>
+      </w:pPr>
+      <w:r>
+        <w:rPr>
+          <w:rFonts w:ascii="Aptos" w:hAnsi="Aptos" w:eastAsia="Aptos" w:cs="Aptos"/>
+          <w:noProof w:val="0"/>
+          <w:sz w:val="24"/>
+          <w:szCs w:val="24"/>
+          <w:lang w:val="pt-BR"/>
+        </w:rPr>
+        <w:t xml:space="preserve">O parágrafo deve ser mantido na página, mas apresentado </w:t>
+      </w:r>
+      <w:r>
+        <w:rPr>
+          <w:rFonts w:ascii="Aptos" w:hAnsi="Aptos" w:eastAsia="Aptos" w:cs="Aptos"/>
+          <w:b w:val="1"/>
+          <w:bCs w:val="1"/>
+          <w:noProof w:val="0"/>
+          <w:sz w:val="24"/>
+          <w:szCs w:val="24"/>
+          <w:lang w:val="pt-BR"/>
+        </w:rPr>
+        <w:t>fora do box de texto</w:t>
+      </w:r>
+      <w:r>
+        <w:rPr>
+          <w:rFonts w:ascii="Aptos" w:hAnsi="Aptos" w:eastAsia="Aptos" w:cs="Aptos"/>
+          <w:noProof w:val="0"/>
+          <w:sz w:val="24"/>
+          <w:szCs w:val="24"/>
+          <w:lang w:val="pt-BR"/>
+        </w:rPr>
+        <w:t>, antes dele.</w:t>
+      </w:r>
+    </w:p>
+    <w:p>
+      <w:pPr>
+        <w:pStyle w:val="Normal"/>
+        <w:suppressLineNumbers w:val="0"/>
+        <w:shd w:val="clear" w:color="auto" w:fill="FFFFFF" w:themeFill="background1"/>
+        <w:bidi w:val="0"/>
+        <w:spacing w:before="0" w:beforeAutospacing="off" w:after="240" w:afterAutospacing="off" w:line="279" w:lineRule="auto"/>
+        <w:ind w:left="0" w:right="0"/>
+        <w:jc w:val="left"/>
+        <w:rPr>
+          <w:rFonts w:ascii="Aptos" w:hAnsi="Aptos" w:eastAsia="Aptos" w:cs="Aptos" w:asciiTheme="minorAscii" w:hAnsiTheme="minorAscii" w:eastAsiaTheme="minorAscii" w:cstheme="minorAscii"/>
+          <w:b w:val="1"/>
+          <w:bCs w:val="1"/>
+          <w:i w:val="0"/>
+          <w:iCs w:val="0"/>
+          <w:caps w:val="0"/>
+          <w:smallCaps w:val="0"/>
+          <w:noProof w:val="0"/>
+          <w:color w:val="auto"/>
+          <w:sz w:val="24"/>
+          <w:szCs w:val="24"/>
+          <w:lang w:val="pt-BR"/>
+        </w:rPr>
+      </w:pPr>
+      <w:r>
+        <w:rPr>
+          <w:rFonts w:ascii="Aptos" w:hAnsi="Aptos" w:eastAsia="Aptos" w:cs="Aptos" w:asciiTheme="minorAscii" w:hAnsiTheme="minorAscii" w:eastAsiaTheme="minorAscii" w:cstheme="minorAscii"/>
+          <w:b w:val="1"/>
+          <w:bCs w:val="1"/>
+          <w:i w:val="0"/>
+          <w:iCs w:val="0"/>
+          <w:caps w:val="0"/>
+          <w:smallCaps w:val="0"/>
+          <w:noProof w:val="0"/>
+          <w:color w:val="auto"/>
+          <w:sz w:val="24"/>
+          <w:szCs w:val="24"/>
+          <w:lang w:val="pt-BR"/>
+        </w:rPr>
+        <w:t xml:space="preserve">7. Após a lição Conhecer para Transformar, </w:t>
+      </w:r>
+      <w:r>
+        <w:rPr>
+          <w:rFonts w:ascii="Aptos" w:hAnsi="Aptos" w:eastAsia="Aptos" w:cs="Aptos" w:asciiTheme="minorAscii" w:hAnsiTheme="minorAscii" w:eastAsiaTheme="minorAscii" w:cstheme="minorAscii"/>
+          <w:b w:val="1"/>
+          <w:bCs w:val="1"/>
+          <w:i w:val="0"/>
+          <w:iCs w:val="0"/>
+          <w:caps w:val="0"/>
+          <w:smallCaps w:val="0"/>
+          <w:noProof w:val="0"/>
+          <w:color w:val="auto"/>
+          <w:sz w:val="24"/>
+          <w:szCs w:val="24"/>
+          <w:highlight w:val="yellow"/>
+          <w:lang w:val="pt-BR"/>
+        </w:rPr>
+        <w:t>adicionar o seguinte fórum:</w:t>
+      </w:r>
+    </w:p>
+    <w:p>
+      <w:pPr>
+        <w:pStyle w:val="Normal"/>
+        <w:bidi w:val="0"/>
+        <w:spacing w:before="240" w:beforeAutospacing="off" w:after="240" w:afterAutospacing="off"/>
+      </w:pPr>
+      <w:r>
+        <w:rPr>
+          <w:noProof w:val="0"/>
+          <w:lang w:val="pt-BR"/>
+        </w:rPr>
+        <w:t>Fórum: Infâncias no território - olhar, escutar e refletir</w:t>
+      </w:r>
+    </w:p>
+    <w:p>
+      <w:pPr>
+        <w:bidi w:val="0"/>
+        <w:spacing w:before="240" w:beforeAutospacing="off" w:after="240" w:afterAutospacing="off"/>
+      </w:pPr>
+      <w:r>
+        <w:rPr>
+          <w:rFonts w:ascii="Aptos" w:hAnsi="Aptos" w:eastAsia="Aptos" w:cs="Aptos"/>
+          <w:noProof w:val="0"/>
+          <w:sz w:val="24"/>
+          <w:szCs w:val="24"/>
+          <w:lang w:val="pt-BR"/>
+        </w:rPr>
+        <w:t>As crianças vivem diferentes realidades, e os territórios onde crescem influenciam suas oportunidades de cuidado, convivência, brincadeira e aprendizagem.</w:t>
+      </w:r>
+    </w:p>
+    <w:p>
+      <w:pPr>
+        <w:bidi w:val="0"/>
+        <w:spacing w:before="240" w:beforeAutospacing="off" w:after="240" w:afterAutospacing="off"/>
+      </w:pPr>
+      <w:r>
+        <w:rPr>
+          <w:rFonts w:ascii="Aptos" w:hAnsi="Aptos" w:eastAsia="Aptos" w:cs="Aptos"/>
+          <w:noProof w:val="0"/>
+          <w:sz w:val="24"/>
+          <w:szCs w:val="24"/>
+          <w:lang w:val="pt-BR"/>
+        </w:rPr>
+        <w:t>Ao longo desta lição, refletimos sobre as desigualdades que podem atravessar a Primeira Infância e sobre a importância das redes de cuidado e proteção. Agora, convidamos você a olhar para o contexto em que vive ou atua e refletir sobre as infâncias presentes nesse território.</w:t>
+      </w:r>
+    </w:p>
+    <w:p>
+      <w:pPr>
+        <w:bidi w:val="0"/>
+        <w:spacing w:before="240" w:beforeAutospacing="off" w:after="240" w:afterAutospacing="off"/>
+      </w:pPr>
+      <w:r>
+        <w:rPr>
+          <w:rFonts w:ascii="Aptos" w:hAnsi="Aptos" w:eastAsia="Aptos" w:cs="Aptos"/>
+          <w:b w:val="1"/>
+          <w:bCs w:val="1"/>
+          <w:noProof w:val="0"/>
+          <w:sz w:val="24"/>
+          <w:szCs w:val="24"/>
+          <w:lang w:val="pt-BR"/>
+        </w:rPr>
+        <w:t>[ABRIR BOX]</w:t>
+      </w:r>
+    </w:p>
+    <w:p>
+      <w:pPr>
+        <w:bidi w:val="0"/>
+        <w:spacing w:before="240" w:beforeAutospacing="off" w:after="240" w:afterAutospacing="off"/>
+      </w:pPr>
+      <w:r>
+        <w:rPr>
+          <w:rFonts w:ascii="Aptos" w:hAnsi="Aptos" w:eastAsia="Aptos" w:cs="Aptos"/>
+          <w:b w:val="1"/>
+          <w:bCs w:val="1"/>
+          <w:noProof w:val="0"/>
+          <w:sz w:val="24"/>
+          <w:szCs w:val="24"/>
+          <w:lang w:val="pt-BR"/>
+        </w:rPr>
+        <w:t>[Ícone de balões de diálogo] Para participar</w:t>
+      </w:r>
+    </w:p>
+    <w:p>
+      <w:pPr>
+        <w:bidi w:val="0"/>
+        <w:spacing w:before="240" w:beforeAutospacing="off" w:after="240" w:afterAutospacing="off"/>
+      </w:pPr>
+      <w:r>
+        <w:rPr>
+          <w:rFonts w:ascii="Aptos" w:hAnsi="Aptos" w:eastAsia="Aptos" w:cs="Aptos"/>
+          <w:noProof w:val="0"/>
+          <w:sz w:val="24"/>
+          <w:szCs w:val="24"/>
+          <w:lang w:val="pt-BR"/>
+        </w:rPr>
+        <w:t>A partir do que discutimos nesta lição, responda à seguinte pergunta:</w:t>
+      </w:r>
+    </w:p>
+    <w:p>
+      <w:pPr>
+        <w:pStyle w:val="Normal"/>
+        <w:bidi w:val="0"/>
+        <w:spacing w:before="240" w:beforeAutospacing="off" w:after="240" w:afterAutospacing="off"/>
+        <w:rPr>
+          <w:rFonts w:ascii="Aptos" w:hAnsi="Aptos" w:eastAsia="Aptos" w:cs="Aptos"/>
+          <w:b w:val="1"/>
+          <w:bCs w:val="1"/>
+          <w:noProof w:val="0"/>
+          <w:sz w:val="24"/>
+          <w:szCs w:val="24"/>
+          <w:lang w:val="pt-BR"/>
+        </w:rPr>
+      </w:pPr>
+      <w:r>
+        <w:rPr>
+          <w:rFonts w:ascii="Aptos" w:hAnsi="Aptos" w:eastAsia="Aptos" w:cs="Aptos"/>
+          <w:b w:val="1"/>
+          <w:bCs w:val="1"/>
+          <w:noProof w:val="0"/>
+          <w:sz w:val="24"/>
+          <w:szCs w:val="24"/>
+          <w:lang w:val="pt-BR"/>
+        </w:rPr>
+        <w:t>Que desigualdades impactam a vida das crianças em seu território e quais redes, pessoas ou iniciativas contribuem</w:t>
+      </w:r>
+      <w:r>
+        <w:rPr>
+          <w:rFonts w:ascii="Aptos" w:hAnsi="Aptos" w:eastAsia="Aptos" w:cs="Aptos"/>
+          <w:b w:val="1"/>
+          <w:bCs w:val="1"/>
+          <w:noProof w:val="0"/>
+          <w:sz w:val="24"/>
+          <w:szCs w:val="24"/>
+          <w:lang w:val="pt-BR"/>
+        </w:rPr>
+        <w:t xml:space="preserve"> </w:t>
+      </w:r>
+      <w:r>
+        <w:rPr>
+          <w:rFonts w:ascii="Aptos" w:hAnsi="Aptos" w:eastAsia="Aptos" w:cs="Aptos"/>
+          <w:b w:val="1"/>
+          <w:bCs w:val="1"/>
+          <w:noProof w:val="0"/>
+          <w:sz w:val="24"/>
+          <w:szCs w:val="24"/>
+          <w:lang w:val="pt-BR"/>
+        </w:rPr>
+        <w:t xml:space="preserve">– </w:t>
+      </w:r>
+      <w:r>
+        <w:rPr>
+          <w:rFonts w:ascii="Aptos" w:hAnsi="Aptos" w:eastAsia="Aptos" w:cs="Aptos"/>
+          <w:b w:val="1"/>
+          <w:bCs w:val="1"/>
+          <w:noProof w:val="0"/>
+          <w:sz w:val="24"/>
+          <w:szCs w:val="24"/>
+          <w:lang w:val="pt-BR"/>
+        </w:rPr>
+        <w:t>ou poderiam contribuir</w:t>
+      </w:r>
+      <w:r>
+        <w:rPr>
+          <w:rFonts w:ascii="Aptos" w:hAnsi="Aptos" w:eastAsia="Aptos" w:cs="Aptos"/>
+          <w:b w:val="1"/>
+          <w:bCs w:val="1"/>
+          <w:noProof w:val="0"/>
+          <w:sz w:val="24"/>
+          <w:szCs w:val="24"/>
+          <w:lang w:val="pt-BR"/>
+        </w:rPr>
+        <w:t xml:space="preserve"> </w:t>
+      </w:r>
+      <w:r>
+        <w:rPr>
+          <w:rFonts w:ascii="Aptos" w:hAnsi="Aptos" w:eastAsia="Aptos" w:cs="Aptos"/>
+          <w:b w:val="1"/>
+          <w:bCs w:val="1"/>
+          <w:noProof w:val="0"/>
+          <w:sz w:val="24"/>
+          <w:szCs w:val="24"/>
+          <w:lang w:val="pt-BR"/>
+        </w:rPr>
+        <w:t xml:space="preserve">– </w:t>
+      </w:r>
+      <w:r>
+        <w:rPr>
+          <w:rFonts w:ascii="Aptos" w:hAnsi="Aptos" w:eastAsia="Aptos" w:cs="Aptos"/>
+          <w:b w:val="1"/>
+          <w:bCs w:val="1"/>
+          <w:noProof w:val="0"/>
+          <w:sz w:val="24"/>
+          <w:szCs w:val="24"/>
+          <w:lang w:val="pt-BR"/>
+        </w:rPr>
+        <w:t>para fortalecer seu cuidado e proteção?</w:t>
+      </w:r>
+      <w:r>
+        <w:rPr>
+          <w:rFonts w:ascii="Aptos" w:hAnsi="Aptos" w:eastAsia="Aptos" w:cs="Aptos"/>
+          <w:b w:val="1"/>
+          <w:bCs w:val="1"/>
+          <w:noProof w:val="0"/>
+          <w:sz w:val="24"/>
+          <w:szCs w:val="24"/>
+          <w:lang w:val="pt-BR"/>
+        </w:rPr>
+        <w:t xml:space="preserve">  </w:t>
+      </w:r>
+    </w:p>
+    <w:p>
+      <w:pPr>
+        <w:bidi w:val="0"/>
+        <w:spacing w:before="240" w:beforeAutospacing="off" w:after="240" w:afterAutospacing="off"/>
+      </w:pPr>
+      <w:r>
+        <w:rPr>
+          <w:rFonts w:ascii="Aptos" w:hAnsi="Aptos" w:eastAsia="Aptos" w:cs="Aptos"/>
+          <w:noProof w:val="0"/>
+          <w:sz w:val="24"/>
+          <w:szCs w:val="24"/>
+          <w:lang w:val="pt-BR"/>
+        </w:rPr>
+        <w:t>Para construir sua resposta, você pode pensar nos espaços, pessoas e iniciativas que já fazem parte desse território e também em ações simples e possíveis que poderiam fortalecer as redes de cuidado ao redor das crianças.</w:t>
+      </w:r>
+    </w:p>
+    <w:p>
+      <w:pPr>
+        <w:bidi w:val="0"/>
+        <w:spacing w:before="0" w:beforeAutospacing="off" w:after="0" w:afterAutospacing="off"/>
+      </w:pPr>
+    </w:p>
+    <w:p>
+      <w:pPr>
+        <w:bidi w:val="0"/>
+        <w:spacing w:before="240" w:beforeAutospacing="off" w:after="240" w:afterAutospacing="off"/>
+        <w:jc w:val="left"/>
+        <w:rPr>
+          <w:rFonts w:ascii="Segoe UI" w:hAnsi="Segoe UI" w:eastAsia="Segoe UI" w:cs="Segoe UI"/>
+          <w:b w:val="0"/>
+          <w:bCs w:val="0"/>
+          <w:i w:val="0"/>
+          <w:iCs w:val="0"/>
+          <w:caps w:val="0"/>
+          <w:smallCaps w:val="0"/>
+          <w:noProof w:val="0"/>
+          <w:color w:val="261810"/>
+          <w:sz w:val="22"/>
+          <w:szCs w:val="22"/>
+          <w:lang w:val="pt-BR"/>
+        </w:rPr>
+      </w:pPr>
+      <w:r>
+        <w:rPr>
+          <w:rFonts w:ascii="Segoe UI" w:hAnsi="Segoe UI" w:eastAsia="Segoe UI" w:cs="Segoe UI"/>
+          <w:b w:val="0"/>
+          <w:bCs w:val="0"/>
+          <w:i w:val="1"/>
+          <w:iCs w:val="1"/>
+          <w:caps w:val="0"/>
+          <w:smallCaps w:val="0"/>
+          <w:noProof w:val="0"/>
+          <w:color w:val="261810"/>
+          <w:sz w:val="22"/>
+          <w:szCs w:val="22"/>
+          <w:lang w:val="pt-BR"/>
+        </w:rPr>
+        <w:t>---------------------------------------------------------------------------------------------------</w:t>
+      </w:r>
+    </w:p>
+    <w:p>
+      <w:pPr>
+        <w:bidi w:val="0"/>
+        <w:spacing w:before="240" w:beforeAutospacing="off" w:after="240" w:afterAutospacing="off" w:line="279" w:lineRule="auto"/>
+        <w:ind w:left="0" w:right="0"/>
+        <w:jc w:val="left"/>
+        <w:rPr>
+          <w:rFonts w:ascii="Aptos" w:hAnsi="Aptos" w:eastAsia="Aptos" w:cs="Aptos"/>
+          <w:b w:val="0"/>
+          <w:bCs w:val="0"/>
+          <w:i w:val="0"/>
+          <w:iCs w:val="0"/>
+          <w:caps w:val="0"/>
+          <w:smallCaps w:val="0"/>
+          <w:noProof w:val="0"/>
+          <w:color w:val="000000" w:themeColor="text1" w:themeTint="FF" w:themeShade="FF"/>
+          <w:sz w:val="24"/>
+          <w:szCs w:val="24"/>
+          <w:lang w:val="pt-BR"/>
+        </w:rPr>
+      </w:pPr>
+      <w:r>
+        <w:rPr>
+          <w:rFonts w:ascii="Aptos" w:hAnsi="Aptos" w:eastAsia="Aptos" w:cs="Aptos"/>
+          <w:b w:val="0"/>
+          <w:bCs w:val="0"/>
+          <w:i w:val="0"/>
+          <w:iCs w:val="0"/>
+          <w:caps w:val="0"/>
+          <w:smallCaps w:val="0"/>
+          <w:noProof w:val="0"/>
+          <w:color w:val="000000" w:themeColor="text1" w:themeTint="FF" w:themeShade="FF"/>
+          <w:sz w:val="24"/>
+          <w:szCs w:val="24"/>
+          <w:lang w:val="pt-BR"/>
+        </w:rPr>
+        <w:t>[manter ícone]</w:t>
+      </w:r>
+      <w:r>
+        <w:rPr>
+          <w:rFonts w:ascii="Aptos" w:hAnsi="Aptos" w:eastAsia="Aptos" w:cs="Aptos"/>
+          <w:b w:val="0"/>
+          <w:bCs w:val="0"/>
+          <w:i w:val="1"/>
+          <w:iCs w:val="1"/>
+          <w:caps w:val="0"/>
+          <w:smallCaps w:val="0"/>
+          <w:noProof w:val="0"/>
+          <w:color w:val="000000" w:themeColor="text1" w:themeTint="FF" w:themeShade="FF"/>
+          <w:sz w:val="24"/>
+          <w:szCs w:val="24"/>
+          <w:lang w:val="pt-BR"/>
+        </w:rPr>
+        <w:t xml:space="preserve"> Após </w:t>
+      </w:r>
+      <w:r>
+        <w:rPr>
+          <w:rFonts w:ascii="Aptos" w:hAnsi="Aptos" w:eastAsia="Aptos" w:cs="Aptos"/>
+          <w:b w:val="1"/>
+          <w:bCs w:val="1"/>
+          <w:i w:val="1"/>
+          <w:iCs w:val="1"/>
+          <w:caps w:val="0"/>
+          <w:smallCaps w:val="0"/>
+          <w:noProof w:val="0"/>
+          <w:color w:val="000000" w:themeColor="text1" w:themeTint="FF" w:themeShade="FF"/>
+          <w:sz w:val="24"/>
+          <w:szCs w:val="24"/>
+          <w:lang w:val="pt-BR"/>
+        </w:rPr>
+        <w:t>sua postagem</w:t>
+      </w:r>
+      <w:r>
+        <w:rPr>
+          <w:rFonts w:ascii="Aptos" w:hAnsi="Aptos" w:eastAsia="Aptos" w:cs="Aptos"/>
+          <w:b w:val="0"/>
+          <w:bCs w:val="0"/>
+          <w:i w:val="1"/>
+          <w:iCs w:val="1"/>
+          <w:caps w:val="0"/>
+          <w:smallCaps w:val="0"/>
+          <w:noProof w:val="0"/>
+          <w:color w:val="000000" w:themeColor="text1" w:themeTint="FF" w:themeShade="FF"/>
+          <w:sz w:val="24"/>
+          <w:szCs w:val="24"/>
+          <w:lang w:val="pt-BR"/>
+        </w:rPr>
+        <w:t xml:space="preserve">, comente em </w:t>
+      </w:r>
+      <w:r>
+        <w:rPr>
+          <w:rFonts w:ascii="Aptos" w:hAnsi="Aptos" w:eastAsia="Aptos" w:cs="Aptos"/>
+          <w:b w:val="1"/>
+          <w:bCs w:val="1"/>
+          <w:i w:val="1"/>
+          <w:iCs w:val="1"/>
+          <w:caps w:val="0"/>
+          <w:smallCaps w:val="0"/>
+          <w:noProof w:val="0"/>
+          <w:color w:val="000000" w:themeColor="text1" w:themeTint="FF" w:themeShade="FF"/>
+          <w:sz w:val="24"/>
+          <w:szCs w:val="24"/>
+          <w:lang w:val="pt-BR"/>
+        </w:rPr>
+        <w:t>pelo menos duas participações</w:t>
+      </w:r>
+      <w:r>
+        <w:rPr>
+          <w:rFonts w:ascii="Aptos" w:hAnsi="Aptos" w:eastAsia="Aptos" w:cs="Aptos"/>
+          <w:b w:val="0"/>
+          <w:bCs w:val="0"/>
+          <w:i w:val="1"/>
+          <w:iCs w:val="1"/>
+          <w:caps w:val="0"/>
+          <w:smallCaps w:val="0"/>
+          <w:noProof w:val="0"/>
+          <w:color w:val="000000" w:themeColor="text1" w:themeTint="FF" w:themeShade="FF"/>
+          <w:sz w:val="24"/>
+          <w:szCs w:val="24"/>
+          <w:lang w:val="pt-BR"/>
+        </w:rPr>
+        <w:t xml:space="preserve"> </w:t>
+      </w:r>
+      <w:r>
+        <w:rPr>
+          <w:rFonts w:ascii="Aptos" w:hAnsi="Aptos" w:eastAsia="Aptos" w:cs="Aptos"/>
+          <w:b w:val="0"/>
+          <w:bCs w:val="0"/>
+          <w:i w:val="1"/>
+          <w:iCs w:val="1"/>
+          <w:caps w:val="0"/>
+          <w:smallCaps w:val="0"/>
+          <w:noProof w:val="0"/>
+          <w:color w:val="000000" w:themeColor="text1" w:themeTint="FF" w:themeShade="FF"/>
+          <w:sz w:val="24"/>
+          <w:szCs w:val="24"/>
+          <w:lang w:val="pt-BR"/>
+        </w:rPr>
+        <w:t>de colegas</w:t>
+      </w:r>
+      <w:r>
+        <w:rPr>
+          <w:rFonts w:ascii="Aptos" w:hAnsi="Aptos" w:eastAsia="Aptos" w:cs="Aptos"/>
+          <w:b w:val="0"/>
+          <w:bCs w:val="0"/>
+          <w:i w:val="1"/>
+          <w:iCs w:val="1"/>
+          <w:caps w:val="0"/>
+          <w:smallCaps w:val="0"/>
+          <w:noProof w:val="0"/>
+          <w:color w:val="000000" w:themeColor="text1" w:themeTint="FF" w:themeShade="FF"/>
+          <w:sz w:val="24"/>
+          <w:szCs w:val="24"/>
+          <w:lang w:val="pt-BR"/>
+        </w:rPr>
+        <w:t xml:space="preserve"> para fortalecermos nossa própria rede de aprendizagem!</w:t>
+      </w:r>
+    </w:p>
+    <w:p>
+      <w:pPr>
+        <w:bidi w:val="0"/>
+        <w:spacing w:before="240" w:beforeAutospacing="off" w:after="240" w:afterAutospacing="off"/>
+        <w:rPr>
+          <w:rFonts w:ascii="Aptos" w:hAnsi="Aptos" w:eastAsia="Aptos" w:cs="Aptos"/>
+          <w:noProof w:val="0"/>
+          <w:sz w:val="24"/>
+          <w:szCs w:val="24"/>
+          <w:lang w:val="pt-BR"/>
+        </w:rPr>
+      </w:pPr>
+    </w:p>
+    <w:p>
+      <w:pPr>
+        <w:bidi w:val="0"/>
+        <w:spacing w:before="240" w:beforeAutospacing="off" w:after="240" w:afterAutospacing="off"/>
+      </w:pPr>
+      <w:r>
+        <w:rPr>
+          <w:rFonts w:ascii="Aptos" w:hAnsi="Aptos" w:eastAsia="Aptos" w:cs="Aptos"/>
+          <w:b w:val="1"/>
+          <w:bCs w:val="1"/>
+          <w:noProof w:val="0"/>
+          <w:sz w:val="24"/>
+          <w:szCs w:val="24"/>
+          <w:lang w:val="pt-BR"/>
+        </w:rPr>
+        <w:t>[FECHAR BOX]</w:t>
+      </w:r>
+    </w:p>
+    <w:p>
+      <w:pPr>
+        <w:pStyle w:val="Normal"/>
+        <w:bidi w:val="0"/>
+        <w:spacing w:before="240" w:beforeAutospacing="off" w:after="240" w:afterAutospacing="off"/>
+        <w:rPr>
+          <w:rFonts w:ascii="Aptos" w:hAnsi="Aptos" w:eastAsia="Aptos" w:cs="Aptos"/>
+          <w:noProof w:val="0"/>
+          <w:sz w:val="24"/>
+          <w:szCs w:val="24"/>
+          <w:lang w:val="pt-BR"/>
+        </w:rPr>
+      </w:pPr>
+    </w:p>
+    <w:p>
+      <w:pPr>
+        <w:pStyle w:val="Normal"/>
+        <w:bidi w:val="0"/>
+        <w:spacing w:before="240" w:beforeAutospacing="off" w:after="240" w:afterAutospacing="off"/>
+        <w:rPr>
+          <w:rFonts w:ascii="Aptos" w:hAnsi="Aptos" w:eastAsia="Aptos" w:cs="Aptos"/>
+          <w:noProof w:val="0"/>
+          <w:sz w:val="24"/>
+          <w:szCs w:val="24"/>
+          <w:lang w:val="pt-BR"/>
+        </w:rPr>
+      </w:pPr>
+    </w:p>
+    <w:p>
+      <w:pPr>
+        <w:bidi w:val="0"/>
+        <w:spacing w:before="240" w:beforeAutospacing="off" w:after="240" w:afterAutospacing="off"/>
+        <w:rPr>
+          <w:rFonts w:ascii="Aptos" w:hAnsi="Aptos" w:eastAsia="Aptos" w:cs="Aptos"/>
+          <w:noProof w:val="0"/>
+          <w:sz w:val="24"/>
+          <w:szCs w:val="24"/>
+          <w:lang w:val="pt-BR"/>
+        </w:rPr>
+      </w:pPr>
+    </w:p>
+    <w:p>
+      <w:pPr>
+        <w:pStyle w:val="Normal"/>
+        <w:bidi w:val="0"/>
+        <w:rPr>
+          <w:noProof w:val="0"/>
+          <w:lang w:val="pt-BR"/>
+        </w:rPr>
+      </w:pPr>
+    </w:p>
+    <w:p>
+      <w:pPr>
+        <w:pStyle w:val="Normal"/>
+        <w:rPr>
+          <w:rFonts w:ascii="Aptos" w:hAnsi="Aptos" w:eastAsia="Aptos" w:cs="Aptos"/>
+          <w:noProof w:val="0"/>
+          <w:color w:val="auto"/>
           <w:sz w:val="24"/>
           <w:szCs w:val="24"/>
           <w:lang w:val="pt-BR"/>
@@ -6334,6 +10055,38 @@
       <w:ind w:left="720"/>
       <w:contextualSpacing/>
     </w:pPr>
+  </w:style>
+  <w:style w:type="paragraph" w:styleId="Heading2">
+    <w:uiPriority w:val="9"/>
+    <w:name w:val="heading 2"/>
+    <w:basedOn w:val="Normal"/>
+    <w:next w:val="Normal"/>
+    <w:unhideWhenUsed/>
+    <w:qFormat/>
+    <w:rsid w:val="028197B9"/>
+    <w:rPr>
+      <w:rFonts w:ascii="Aptos Display" w:hAnsi="Aptos Display" w:eastAsia="" w:cs="" w:asciiTheme="majorAscii" w:hAnsiTheme="majorAscii" w:eastAsiaTheme="majorEastAsia" w:cstheme="majorBidi"/>
+      <w:color w:val="0F4761" w:themeColor="accent1" w:themeTint="FF" w:themeShade="BF"/>
+      <w:sz w:val="32"/>
+      <w:szCs w:val="32"/>
+    </w:rPr>
+    <w:pPr>
+      <w:keepNext w:val="1"/>
+      <w:keepLines w:val="1"/>
+      <w:spacing w:before="160" w:after="80"/>
+      <w:outlineLvl w:val="1"/>
+    </w:pPr>
+  </w:style>
+  <w:style w:type="character" w:styleId="Hyperlink">
+    <w:uiPriority w:val="99"/>
+    <w:name w:val="Hyperlink"/>
+    <w:basedOn w:val="DefaultParagraphFont"/>
+    <w:unhideWhenUsed/>
+    <w:rsid w:val="028197B9"/>
+    <w:rPr>
+      <w:color w:val="467886"/>
+      <w:u w:val="single"/>
+    </w:rPr>
   </w:style>
 </w:styles>
 </file>

</xml_diff>